<commit_message>
docs(outreach): what to do after logging in to each platform
Co-Authored-By: Claude Fable 5.1 <noreply@anthropic.com>
</commit_message>
<xml_diff>
--- a/docs/fullstack-placement-registry.docx
+++ b/docs/fullstack-placement-registry.docx
@@ -8481,6 +8481,416 @@
         <w:t xml:space="preserve"> in agency mode. That is where the placements come from.</w:t>
       </w:r>
     </w:p>
+    <w:p>
+      <w:pPr>
+        <w:pStyle w:val="Heading1"/>
+      </w:pPr>
+      <w:r>
+        <w:t>11. After you log in</w:t>
+      </w:r>
+    </w:p>
+    <w:p>
+      <w:r>
+        <w:t>The same four things on every site, in this order. A half-filled profile is invisible to a recruiter's search filter; the filter is the whole game.</w:t>
+      </w:r>
+    </w:p>
+    <w:p>
+      <w:pPr>
+        <w:pStyle w:val="ListNumber"/>
+      </w:pPr>
+      <w:r>
+        <w:rPr>
+          <w:b/>
+        </w:rPr>
+        <w:t>Profile to 100%.</w:t>
+      </w:r>
+      <w:r>
+        <w:t xml:space="preserve"> Title exactly </w:t>
+      </w:r>
+      <w:r>
+        <w:rPr>
+          <w:rFonts w:ascii="Consolas" w:hAnsi="Consolas"/>
+          <w:sz w:val="20"/>
+        </w:rPr>
+        <w:t>Senior MERN Stack Developer · AI Systems</w:t>
+      </w:r>
+      <w:r>
+        <w:t>.</w:t>
+      </w:r>
+    </w:p>
+    <w:p>
+      <w:r>
+        <w:t>Years: 5. Skills typed the way the site's dropdown spells them: React, Node.js, MongoDB, Express, Next.js, TypeScript, Python, FastAPI, RAG, LLM. Add every one the dropdown offers; recruiters filter on these fields, not on the PDF.</w:t>
+      </w:r>
+    </w:p>
+    <w:p>
+      <w:pPr>
+        <w:pStyle w:val="ListNumber"/>
+      </w:pPr>
+      <w:r>
+        <w:rPr>
+          <w:b/>
+        </w:rPr>
+        <w:t>Upload the PDF</w:t>
+      </w:r>
+      <w:r>
+        <w:t xml:space="preserve"> (</w:t>
+      </w:r>
+      <w:r>
+        <w:rPr>
+          <w:rFonts w:ascii="Consolas" w:hAnsi="Consolas"/>
+          <w:sz w:val="20"/>
+        </w:rPr>
+        <w:t>Resume.pdf</w:t>
+      </w:r>
+      <w:r>
+        <w:t xml:space="preserve"> from the site). Where the site asks for a</w:t>
+      </w:r>
+    </w:p>
+    <w:p>
+      <w:r>
+        <w:t>headline or summary, paste the summary paragraph from page 1.</w:t>
+      </w:r>
+    </w:p>
+    <w:p>
+      <w:pPr>
+        <w:pStyle w:val="ListNumber"/>
+      </w:pPr>
+      <w:r>
+        <w:rPr>
+          <w:b/>
+        </w:rPr>
+        <w:t>Preferences:</w:t>
+      </w:r>
+      <w:r>
+        <w:t xml:space="preserve"> locations Hyderabad + Remote; work mode remote / hybrid /</w:t>
+      </w:r>
+    </w:p>
+    <w:p>
+      <w:r>
+        <w:t>on-site all ticked; notice period honest; expected CTC a range, not a number. Turn on "open to opportunities" or "visible to recruiters" wherever the toggle exists.</w:t>
+      </w:r>
+    </w:p>
+    <w:p>
+      <w:pPr>
+        <w:pStyle w:val="ListNumber"/>
+      </w:pPr>
+      <w:r>
+        <w:rPr>
+          <w:b/>
+        </w:rPr>
+        <w:t>One action inside the site.</w:t>
+      </w:r>
+      <w:r>
+        <w:t xml:space="preserve"> Apply to one live full-stack role, or</w:t>
+      </w:r>
+    </w:p>
+    <w:p>
+      <w:r>
+        <w:t>message one recruiter. Fresh activity moves you up most platforms' recruiter searches; a dormant profile sinks.</w:t>
+      </w:r>
+    </w:p>
+    <w:p>
+      <w:r>
+        <w:t>Platform-specific gates, so none is a surprise:</w:t>
+      </w:r>
+    </w:p>
+    <w:tbl>
+      <w:tblPr>
+        <w:tblStyle w:val="TableGrid"/>
+        <w:tblW w:type="auto" w:w="0"/>
+        <w:jc w:val="center"/>
+        <w:tblLook w:firstColumn="1" w:firstRow="1" w:lastColumn="0" w:lastRow="0" w:noHBand="0" w:noVBand="1" w:val="04A0"/>
+      </w:tblPr>
+      <w:tblGrid>
+        <w:gridCol w:w="5320"/>
+        <w:gridCol w:w="5320"/>
+      </w:tblGrid>
+      <w:tr>
+        <w:tc>
+          <w:tcPr>
+            <w:tcW w:type="dxa" w:w="5320"/>
+            <w:shd w:val="clear" w:color="auto" w:fill="F5F5F4"/>
+          </w:tcPr>
+          <w:p>
+            <w:pPr>
+              <w:spacing w:after="0"/>
+            </w:pPr>
+            <w:r>
+              <w:rPr>
+                <w:b/>
+                <w:sz w:val="19"/>
+              </w:rPr>
+              <w:t>platform</w:t>
+            </w:r>
+          </w:p>
+        </w:tc>
+        <w:tc>
+          <w:tcPr>
+            <w:tcW w:type="dxa" w:w="5320"/>
+            <w:shd w:val="clear" w:color="auto" w:fill="F5F5F4"/>
+          </w:tcPr>
+          <w:p>
+            <w:pPr>
+              <w:spacing w:after="0"/>
+            </w:pPr>
+            <w:r>
+              <w:rPr>
+                <w:b/>
+                <w:sz w:val="19"/>
+              </w:rPr>
+              <w:t>what happens after sign-up</w:t>
+            </w:r>
+          </w:p>
+        </w:tc>
+      </w:tr>
+      <w:tr>
+        <w:tc>
+          <w:tcPr>
+            <w:tcW w:type="dxa" w:w="5320"/>
+          </w:tcPr>
+          <w:p>
+            <w:pPr>
+              <w:spacing w:after="0"/>
+            </w:pPr>
+            <w:r>
+              <w:rPr>
+                <w:b/>
+                <w:sz w:val="19"/>
+              </w:rPr>
+              <w:t>Pesto</w:t>
+            </w:r>
+          </w:p>
+        </w:tc>
+        <w:tc>
+          <w:tcPr>
+            <w:tcW w:type="dxa" w:w="5320"/>
+          </w:tcPr>
+          <w:p>
+            <w:pPr>
+              <w:spacing w:after="0"/>
+            </w:pPr>
+            <w:r>
+              <w:rPr>
+                <w:sz w:val="19"/>
+              </w:rPr>
+              <w:t>profile, then a screening round (coding + AI-driven vetting). Block an evening for it; no partner sees you before it is passed</w:t>
+            </w:r>
+          </w:p>
+        </w:tc>
+      </w:tr>
+      <w:tr>
+        <w:tc>
+          <w:tcPr>
+            <w:tcW w:type="dxa" w:w="5320"/>
+          </w:tcPr>
+          <w:p>
+            <w:pPr>
+              <w:spacing w:after="0"/>
+            </w:pPr>
+            <w:r>
+              <w:rPr>
+                <w:b/>
+                <w:sz w:val="19"/>
+              </w:rPr>
+              <w:t>Toptal</w:t>
+            </w:r>
+          </w:p>
+        </w:tc>
+        <w:tc>
+          <w:tcPr>
+            <w:tcW w:type="dxa" w:w="5320"/>
+          </w:tcPr>
+          <w:p>
+            <w:pPr>
+              <w:spacing w:after="0"/>
+            </w:pPr>
+            <w:r>
+              <w:rPr>
+                <w:sz w:val="19"/>
+              </w:rPr>
+              <w:t>English/communication call, timed algorithm test, live coding, then a test project. Two to three weeks end to end; 3% pass rate they publish</w:t>
+            </w:r>
+          </w:p>
+        </w:tc>
+      </w:tr>
+      <w:tr>
+        <w:tc>
+          <w:tcPr>
+            <w:tcW w:type="dxa" w:w="5320"/>
+          </w:tcPr>
+          <w:p>
+            <w:pPr>
+              <w:spacing w:after="0"/>
+            </w:pPr>
+            <w:r>
+              <w:rPr>
+                <w:b/>
+                <w:sz w:val="19"/>
+              </w:rPr>
+              <w:t>Turing</w:t>
+            </w:r>
+          </w:p>
+        </w:tc>
+        <w:tc>
+          <w:tcPr>
+            <w:tcW w:type="dxa" w:w="5320"/>
+          </w:tcPr>
+          <w:p>
+            <w:pPr>
+              <w:spacing w:after="0"/>
+            </w:pPr>
+            <w:r>
+              <w:rPr>
+                <w:sz w:val="19"/>
+              </w:rPr>
+              <w:t>automated skills tests per stack, then a live interview; roles then appear in the dashboard to apply to</w:t>
+            </w:r>
+          </w:p>
+        </w:tc>
+      </w:tr>
+      <w:tr>
+        <w:tc>
+          <w:tcPr>
+            <w:tcW w:type="dxa" w:w="5320"/>
+          </w:tcPr>
+          <w:p>
+            <w:pPr>
+              <w:spacing w:after="0"/>
+            </w:pPr>
+            <w:r>
+              <w:rPr>
+                <w:b/>
+                <w:sz w:val="19"/>
+              </w:rPr>
+              <w:t>Andela</w:t>
+            </w:r>
+          </w:p>
+        </w:tc>
+        <w:tc>
+          <w:tcPr>
+            <w:tcW w:type="dxa" w:w="5320"/>
+          </w:tcPr>
+          <w:p>
+            <w:pPr>
+              <w:spacing w:after="0"/>
+            </w:pPr>
+            <w:r>
+              <w:rPr>
+                <w:sz w:val="19"/>
+              </w:rPr>
+              <w:t>profile and assessment, then matched to roles; no public job board to browse</w:t>
+            </w:r>
+          </w:p>
+        </w:tc>
+      </w:tr>
+      <w:tr>
+        <w:tc>
+          <w:tcPr>
+            <w:tcW w:type="dxa" w:w="5320"/>
+          </w:tcPr>
+          <w:p>
+            <w:pPr>
+              <w:spacing w:after="0"/>
+            </w:pPr>
+            <w:r>
+              <w:rPr>
+                <w:b/>
+                <w:sz w:val="19"/>
+              </w:rPr>
+              <w:t>Cutshort</w:t>
+            </w:r>
+          </w:p>
+        </w:tc>
+        <w:tc>
+          <w:tcPr>
+            <w:tcW w:type="dxa" w:w="5320"/>
+          </w:tcPr>
+          <w:p>
+            <w:pPr>
+              <w:spacing w:after="0"/>
+            </w:pPr>
+            <w:r>
+              <w:rPr>
+                <w:sz w:val="19"/>
+              </w:rPr>
+              <w:t>upload résumé, then companies invite you. The feed is public; apply to EZEU's roles directly from its company page</w:t>
+            </w:r>
+          </w:p>
+        </w:tc>
+      </w:tr>
+      <w:tr>
+        <w:tc>
+          <w:tcPr>
+            <w:tcW w:type="dxa" w:w="5320"/>
+          </w:tcPr>
+          <w:p>
+            <w:pPr>
+              <w:spacing w:after="0"/>
+            </w:pPr>
+            <w:r>
+              <w:rPr>
+                <w:b/>
+                <w:sz w:val="19"/>
+              </w:rPr>
+              <w:t>Talent500</w:t>
+            </w:r>
+          </w:p>
+        </w:tc>
+        <w:tc>
+          <w:tcPr>
+            <w:tcW w:type="dxa" w:w="5320"/>
+          </w:tcPr>
+          <w:p>
+            <w:pPr>
+              <w:spacing w:after="0"/>
+            </w:pPr>
+            <w:r>
+              <w:rPr>
+                <w:sz w:val="19"/>
+              </w:rPr>
+              <w:t>AI-matched after profile; confirm there is no candidate fee at the paywall if one appears</w:t>
+            </w:r>
+          </w:p>
+        </w:tc>
+      </w:tr>
+      <w:tr>
+        <w:tc>
+          <w:tcPr>
+            <w:tcW w:type="dxa" w:w="5320"/>
+          </w:tcPr>
+          <w:p>
+            <w:pPr>
+              <w:spacing w:after="0"/>
+            </w:pPr>
+            <w:r>
+              <w:rPr>
+                <w:b/>
+                <w:sz w:val="19"/>
+              </w:rPr>
+              <w:t>Big agencies (§2–§6)</w:t>
+            </w:r>
+          </w:p>
+        </w:tc>
+        <w:tc>
+          <w:tcPr>
+            <w:tcW w:type="dxa" w:w="5320"/>
+          </w:tcPr>
+          <w:p>
+            <w:pPr>
+              <w:spacing w:after="0"/>
+            </w:pPr>
+            <w:r>
+              <w:rPr>
+                <w:sz w:val="19"/>
+              </w:rPr>
+              <w:t>upload lands in an ATS. Nothing happens until a recruiter searches it, which is why step 4 above and the named-recruiter email matter more here than anywhere</w:t>
+            </w:r>
+          </w:p>
+        </w:tc>
+      </w:tr>
+    </w:tbl>
+    <w:p/>
     <w:sectPr>
       <w:pgSz w:w="12240" w:h="15840"/>
       <w:pgMar w:top="800" w:right="800" w:bottom="800" w:left="800" w:header="720" w:footer="720" w:gutter="0"/>

</xml_diff>

<commit_message>
docs(outreach): 25 more agencies in the placement registry
Nine India IT staffing firms (Han Digital with a Hyderabad office, Avance,
Innova, Diverse Lynx, Mastech, LanceSoft, NLB, Taggd, Mancer), four
remote marketplaces (Index.dev, Torc, VanHack, Mercor with a note that
it is AI-eval gig work rather than full-stack roles), Caliberly in Dubai,
and seven UK/EU/US tech specialists (CyberCoders, Harvey Nash, Lorien,
Understanding Recruitment, Trust in SODA, Akkodis, Randstad Digital).

Every URL fetched and 200. talent.io excluded and flagged: its TLS
certificate is issued for *.herokuapp.com, not its hostname.

Co-Authored-By: Claude Fable 5.1 <noreply@anthropic.com>
</commit_message>
<xml_diff>
--- a/docs/fullstack-placement-registry.docx
+++ b/docs/fullstack-placement-registry.docx
@@ -8891,6 +8891,2861 @@
       </w:tr>
     </w:tbl>
     <w:p/>
+    <w:p>
+      <w:pPr>
+        <w:pStyle w:val="Heading1"/>
+      </w:pPr>
+      <w:r>
+        <w:t>12. More agencies, added 2026-10-22</w:t>
+      </w:r>
+    </w:p>
+    <w:p>
+      <w:r>
+        <w:t xml:space="preserve">Same rules: every link fetched and </w:t>
+      </w:r>
+      <w:r>
+        <w:rPr>
+          <w:rFonts w:ascii="Consolas" w:hAnsi="Consolas"/>
+          <w:sz w:val="20"/>
+        </w:rPr>
+        <w:t>200</w:t>
+      </w:r>
+      <w:r>
+        <w:t xml:space="preserve"> on the date; who pays is stated where the firm states it; firms whose site could not be read are at the end.</w:t>
+      </w:r>
+    </w:p>
+    <w:p>
+      <w:pPr>
+        <w:pStyle w:val="Heading2"/>
+      </w:pPr>
+      <w:r>
+        <w:t>India</w:t>
+      </w:r>
+    </w:p>
+    <w:tbl>
+      <w:tblPr>
+        <w:tblStyle w:val="TableGrid"/>
+        <w:tblW w:type="auto" w:w="0"/>
+        <w:jc w:val="center"/>
+        <w:tblLook w:firstColumn="1" w:firstRow="1" w:lastColumn="0" w:lastRow="0" w:noHBand="0" w:noVBand="1" w:val="04A0"/>
+      </w:tblPr>
+      <w:tblGrid>
+        <w:gridCol w:w="2128"/>
+        <w:gridCol w:w="2128"/>
+        <w:gridCol w:w="2128"/>
+        <w:gridCol w:w="2128"/>
+        <w:gridCol w:w="2128"/>
+      </w:tblGrid>
+      <w:tr>
+        <w:tc>
+          <w:tcPr>
+            <w:tcW w:type="dxa" w:w="2128"/>
+            <w:shd w:val="clear" w:color="auto" w:fill="F5F5F4"/>
+          </w:tcPr>
+          <w:p>
+            <w:pPr>
+              <w:spacing w:after="0"/>
+            </w:pPr>
+            <w:r>
+              <w:rPr>
+                <w:b/>
+                <w:sz w:val="19"/>
+              </w:rPr>
+              <w:t>firm</w:t>
+            </w:r>
+          </w:p>
+        </w:tc>
+        <w:tc>
+          <w:tcPr>
+            <w:tcW w:type="dxa" w:w="2128"/>
+            <w:shd w:val="clear" w:color="auto" w:fill="F5F5F4"/>
+          </w:tcPr>
+          <w:p>
+            <w:pPr>
+              <w:spacing w:after="0"/>
+            </w:pPr>
+            <w:r>
+              <w:rPr>
+                <w:b/>
+                <w:sz w:val="19"/>
+              </w:rPr>
+              <w:t>who pays</w:t>
+            </w:r>
+          </w:p>
+        </w:tc>
+        <w:tc>
+          <w:tcPr>
+            <w:tcW w:type="dxa" w:w="2128"/>
+            <w:shd w:val="clear" w:color="auto" w:fill="F5F5F4"/>
+          </w:tcPr>
+          <w:p>
+            <w:pPr>
+              <w:spacing w:after="0"/>
+            </w:pPr>
+            <w:r>
+              <w:rPr>
+                <w:b/>
+                <w:sz w:val="19"/>
+              </w:rPr>
+              <w:t>fee</w:t>
+            </w:r>
+          </w:p>
+        </w:tc>
+        <w:tc>
+          <w:tcPr>
+            <w:tcW w:type="dxa" w:w="2128"/>
+            <w:shd w:val="clear" w:color="auto" w:fill="F5F5F4"/>
+          </w:tcPr>
+          <w:p>
+            <w:pPr>
+              <w:spacing w:after="0"/>
+            </w:pPr>
+            <w:r>
+              <w:rPr>
+                <w:b/>
+                <w:sz w:val="19"/>
+              </w:rPr>
+              <w:t>register</w:t>
+            </w:r>
+          </w:p>
+        </w:tc>
+        <w:tc>
+          <w:tcPr>
+            <w:tcW w:type="dxa" w:w="2128"/>
+            <w:shd w:val="clear" w:color="auto" w:fill="F5F5F4"/>
+          </w:tcPr>
+          <w:p>
+            <w:pPr>
+              <w:spacing w:after="0"/>
+            </w:pPr>
+            <w:r>
+              <w:rPr>
+                <w:b/>
+                <w:sz w:val="19"/>
+              </w:rPr>
+              <w:t>fit</w:t>
+            </w:r>
+          </w:p>
+        </w:tc>
+      </w:tr>
+      <w:tr>
+        <w:tc>
+          <w:tcPr>
+            <w:tcW w:type="dxa" w:w="2128"/>
+          </w:tcPr>
+          <w:p>
+            <w:pPr>
+              <w:spacing w:after="0"/>
+            </w:pPr>
+            <w:r>
+              <w:rPr>
+                <w:b/>
+                <w:sz w:val="19"/>
+              </w:rPr>
+              <w:t>Avance Services</w:t>
+            </w:r>
+          </w:p>
+        </w:tc>
+        <w:tc>
+          <w:tcPr>
+            <w:tcW w:type="dxa" w:w="2128"/>
+          </w:tcPr>
+          <w:p>
+            <w:pPr>
+              <w:spacing w:after="0"/>
+            </w:pPr>
+            <w:r>
+              <w:rPr>
+                <w:sz w:val="19"/>
+              </w:rPr>
+              <w:t>employer</w:t>
+            </w:r>
+          </w:p>
+        </w:tc>
+        <w:tc>
+          <w:tcPr>
+            <w:tcW w:type="dxa" w:w="2128"/>
+          </w:tcPr>
+          <w:p>
+            <w:pPr>
+              <w:spacing w:after="0"/>
+            </w:pPr>
+            <w:r>
+              <w:rPr>
+                <w:sz w:val="19"/>
+              </w:rPr>
+              <w:t>free</w:t>
+            </w:r>
+          </w:p>
+        </w:tc>
+        <w:tc>
+          <w:tcPr>
+            <w:tcW w:type="dxa" w:w="2128"/>
+          </w:tcPr>
+          <w:p>
+            <w:pPr>
+              <w:spacing w:after="0"/>
+            </w:pPr>
+            <w:hyperlink r:id="rId85">
+              <w:r>
+                <w:rPr>
+                  <w:color w:val="7F1D3A"/>
+                  <w:u w:val="single"/>
+                  <w:sz w:val="19"/>
+                </w:rPr>
+                <w:t xml:space="preserve">avanceservices.com/upload-resume/</w:t>
+              </w:r>
+            </w:hyperlink>
+            <w:r>
+              <w:rPr>
+                <w:sz w:val="19"/>
+              </w:rPr>
+              <w:t xml:space="preserve"> · jobs: </w:t>
+            </w:r>
+            <w:hyperlink r:id="rId86">
+              <w:r>
+                <w:rPr>
+                  <w:color w:val="7F1D3A"/>
+                  <w:u w:val="single"/>
+                  <w:sz w:val="19"/>
+                </w:rPr>
+                <w:t xml:space="preserve">jobs.avanceservices.com/</w:t>
+              </w:r>
+            </w:hyperlink>
+          </w:p>
+        </w:tc>
+        <w:tc>
+          <w:tcPr>
+            <w:tcW w:type="dxa" w:w="2128"/>
+          </w:tcPr>
+          <w:p>
+            <w:pPr>
+              <w:spacing w:after="0"/>
+            </w:pPr>
+            <w:r>
+              <w:rPr>
+                <w:sz w:val="19"/>
+              </w:rPr>
+              <w:t>IT practice: digital, data, AI/ML, infrastructure, ERP; India office</w:t>
+            </w:r>
+          </w:p>
+        </w:tc>
+      </w:tr>
+      <w:tr>
+        <w:tc>
+          <w:tcPr>
+            <w:tcW w:type="dxa" w:w="2128"/>
+          </w:tcPr>
+          <w:p>
+            <w:pPr>
+              <w:spacing w:after="0"/>
+            </w:pPr>
+            <w:r>
+              <w:rPr>
+                <w:b/>
+                <w:sz w:val="19"/>
+              </w:rPr>
+              <w:t>Han Digital</w:t>
+            </w:r>
+          </w:p>
+        </w:tc>
+        <w:tc>
+          <w:tcPr>
+            <w:tcW w:type="dxa" w:w="2128"/>
+          </w:tcPr>
+          <w:p>
+            <w:pPr>
+              <w:spacing w:after="0"/>
+            </w:pPr>
+            <w:r>
+              <w:rPr>
+                <w:sz w:val="19"/>
+              </w:rPr>
+              <w:t>employer</w:t>
+            </w:r>
+          </w:p>
+        </w:tc>
+        <w:tc>
+          <w:tcPr>
+            <w:tcW w:type="dxa" w:w="2128"/>
+          </w:tcPr>
+          <w:p>
+            <w:pPr>
+              <w:spacing w:after="0"/>
+            </w:pPr>
+            <w:r>
+              <w:rPr>
+                <w:sz w:val="19"/>
+              </w:rPr>
+              <w:t>free</w:t>
+            </w:r>
+          </w:p>
+        </w:tc>
+        <w:tc>
+          <w:tcPr>
+            <w:tcW w:type="dxa" w:w="2128"/>
+          </w:tcPr>
+          <w:p>
+            <w:pPr>
+              <w:spacing w:after="0"/>
+            </w:pPr>
+            <w:hyperlink r:id="rId87">
+              <w:r>
+                <w:rPr>
+                  <w:color w:val="7F1D3A"/>
+                  <w:u w:val="single"/>
+                  <w:sz w:val="19"/>
+                </w:rPr>
+                <w:t xml:space="preserve">www.handigital.com/careers/</w:t>
+              </w:r>
+            </w:hyperlink>
+            <w:r>
+              <w:rPr>
+                <w:sz w:val="19"/>
+              </w:rPr>
+              <w:t xml:space="preserve"> · </w:t>
+            </w:r>
+            <w:r>
+              <w:rPr>
+                <w:rFonts w:ascii="Consolas" w:hAnsi="Consolas"/>
+                <w:sz w:val="17"/>
+              </w:rPr>
+              <w:t>contact@handigital.com</w:t>
+            </w:r>
+          </w:p>
+        </w:tc>
+        <w:tc>
+          <w:tcPr>
+            <w:tcW w:type="dxa" w:w="2128"/>
+          </w:tcPr>
+          <w:p>
+            <w:pPr>
+              <w:spacing w:after="0"/>
+            </w:pPr>
+            <w:r>
+              <w:rPr>
+                <w:sz w:val="19"/>
+              </w:rPr>
+              <w:t xml:space="preserve">HQ Bengaluru; offices </w:t>
+            </w:r>
+            <w:r>
+              <w:rPr>
+                <w:b/>
+                <w:sz w:val="19"/>
+              </w:rPr>
+              <w:t>Hyderabad</w:t>
+            </w:r>
+            <w:r>
+              <w:rPr>
+                <w:sz w:val="19"/>
+              </w:rPr>
+              <w:t>, Delhi NCR, Coimbatore, Dubai; app development, AI and data, cloud, DevOps</w:t>
+            </w:r>
+          </w:p>
+        </w:tc>
+      </w:tr>
+      <w:tr>
+        <w:tc>
+          <w:tcPr>
+            <w:tcW w:type="dxa" w:w="2128"/>
+          </w:tcPr>
+          <w:p>
+            <w:pPr>
+              <w:spacing w:after="0"/>
+            </w:pPr>
+            <w:r>
+              <w:rPr>
+                <w:b/>
+                <w:sz w:val="19"/>
+              </w:rPr>
+              <w:t>Innova Solutions</w:t>
+            </w:r>
+          </w:p>
+        </w:tc>
+        <w:tc>
+          <w:tcPr>
+            <w:tcW w:type="dxa" w:w="2128"/>
+          </w:tcPr>
+          <w:p>
+            <w:pPr>
+              <w:spacing w:after="0"/>
+            </w:pPr>
+            <w:r>
+              <w:rPr>
+                <w:sz w:val="19"/>
+              </w:rPr>
+              <w:t>employer</w:t>
+            </w:r>
+          </w:p>
+        </w:tc>
+        <w:tc>
+          <w:tcPr>
+            <w:tcW w:type="dxa" w:w="2128"/>
+          </w:tcPr>
+          <w:p>
+            <w:pPr>
+              <w:spacing w:after="0"/>
+            </w:pPr>
+            <w:r>
+              <w:rPr>
+                <w:sz w:val="19"/>
+              </w:rPr>
+              <w:t>free</w:t>
+            </w:r>
+          </w:p>
+        </w:tc>
+        <w:tc>
+          <w:tcPr>
+            <w:tcW w:type="dxa" w:w="2128"/>
+          </w:tcPr>
+          <w:p>
+            <w:pPr>
+              <w:spacing w:after="0"/>
+            </w:pPr>
+            <w:hyperlink r:id="rId88">
+              <w:r>
+                <w:rPr>
+                  <w:color w:val="7F1D3A"/>
+                  <w:u w:val="single"/>
+                  <w:sz w:val="19"/>
+                </w:rPr>
+                <w:t xml:space="preserve">innovasolutions.com/careers/</w:t>
+              </w:r>
+            </w:hyperlink>
+            <w:r>
+              <w:rPr>
+                <w:sz w:val="19"/>
+              </w:rPr>
+              <w:t xml:space="preserve"> · </w:t>
+            </w:r>
+            <w:r>
+              <w:rPr>
+                <w:rFonts w:ascii="Consolas" w:hAnsi="Consolas"/>
+                <w:sz w:val="17"/>
+              </w:rPr>
+              <w:t>info@innovasolutions.com</w:t>
+            </w:r>
+          </w:p>
+        </w:tc>
+        <w:tc>
+          <w:tcPr>
+            <w:tcW w:type="dxa" w:w="2128"/>
+          </w:tcPr>
+          <w:p>
+            <w:pPr>
+              <w:spacing w:after="0"/>
+            </w:pPr>
+            <w:r>
+              <w:rPr>
+                <w:sz w:val="19"/>
+              </w:rPr>
+              <w:t>global IT services and staffing; India under APAC</w:t>
+            </w:r>
+          </w:p>
+        </w:tc>
+      </w:tr>
+      <w:tr>
+        <w:tc>
+          <w:tcPr>
+            <w:tcW w:type="dxa" w:w="2128"/>
+          </w:tcPr>
+          <w:p>
+            <w:pPr>
+              <w:spacing w:after="0"/>
+            </w:pPr>
+            <w:r>
+              <w:rPr>
+                <w:b/>
+                <w:sz w:val="19"/>
+              </w:rPr>
+              <w:t>Diverse Lynx</w:t>
+            </w:r>
+          </w:p>
+        </w:tc>
+        <w:tc>
+          <w:tcPr>
+            <w:tcW w:type="dxa" w:w="2128"/>
+          </w:tcPr>
+          <w:p>
+            <w:pPr>
+              <w:spacing w:after="0"/>
+            </w:pPr>
+            <w:r>
+              <w:rPr>
+                <w:sz w:val="19"/>
+              </w:rPr>
+              <w:t>employer</w:t>
+            </w:r>
+          </w:p>
+        </w:tc>
+        <w:tc>
+          <w:tcPr>
+            <w:tcW w:type="dxa" w:w="2128"/>
+          </w:tcPr>
+          <w:p>
+            <w:pPr>
+              <w:spacing w:after="0"/>
+            </w:pPr>
+            <w:r>
+              <w:rPr>
+                <w:sz w:val="19"/>
+              </w:rPr>
+              <w:t>free</w:t>
+            </w:r>
+          </w:p>
+        </w:tc>
+        <w:tc>
+          <w:tcPr>
+            <w:tcW w:type="dxa" w:w="2128"/>
+          </w:tcPr>
+          <w:p>
+            <w:pPr>
+              <w:spacing w:after="0"/>
+            </w:pPr>
+            <w:r>
+              <w:rPr>
+                <w:sz w:val="19"/>
+              </w:rPr>
+              <w:t xml:space="preserve">JobDiva portal via </w:t>
+            </w:r>
+            <w:hyperlink r:id="rId89">
+              <w:r>
+                <w:rPr>
+                  <w:color w:val="7F1D3A"/>
+                  <w:u w:val="single"/>
+                  <w:sz w:val="19"/>
+                </w:rPr>
+                <w:t xml:space="preserve">www.diverselynx.com/</w:t>
+              </w:r>
+            </w:hyperlink>
+            <w:r>
+              <w:rPr>
+                <w:sz w:val="19"/>
+              </w:rPr>
+              <w:t xml:space="preserve"> · </w:t>
+            </w:r>
+            <w:r>
+              <w:rPr>
+                <w:rFonts w:ascii="Consolas" w:hAnsi="Consolas"/>
+                <w:sz w:val="17"/>
+              </w:rPr>
+              <w:t>info@diverselynx.com</w:t>
+            </w:r>
+            <w:r>
+              <w:rPr>
+                <w:sz w:val="19"/>
+              </w:rPr>
+              <w:t xml:space="preserve"> · </w:t>
+            </w:r>
+            <w:r>
+              <w:rPr>
+                <w:rFonts w:ascii="Consolas" w:hAnsi="Consolas"/>
+                <w:sz w:val="17"/>
+              </w:rPr>
+              <w:t>+91-120-4604500</w:t>
+            </w:r>
+          </w:p>
+        </w:tc>
+        <w:tc>
+          <w:tcPr>
+            <w:tcW w:type="dxa" w:w="2128"/>
+          </w:tcPr>
+          <w:p>
+            <w:pPr>
+              <w:spacing w:after="0"/>
+            </w:pPr>
+            <w:r>
+              <w:rPr>
+                <w:sz w:val="19"/>
+              </w:rPr>
+              <w:t>US–India IT staffing; Noida office</w:t>
+            </w:r>
+          </w:p>
+        </w:tc>
+      </w:tr>
+      <w:tr>
+        <w:tc>
+          <w:tcPr>
+            <w:tcW w:type="dxa" w:w="2128"/>
+          </w:tcPr>
+          <w:p>
+            <w:pPr>
+              <w:spacing w:after="0"/>
+            </w:pPr>
+            <w:r>
+              <w:rPr>
+                <w:b/>
+                <w:sz w:val="19"/>
+              </w:rPr>
+              <w:t>Mastech</w:t>
+            </w:r>
+          </w:p>
+        </w:tc>
+        <w:tc>
+          <w:tcPr>
+            <w:tcW w:type="dxa" w:w="2128"/>
+          </w:tcPr>
+          <w:p>
+            <w:pPr>
+              <w:spacing w:after="0"/>
+            </w:pPr>
+            <w:r>
+              <w:rPr>
+                <w:sz w:val="19"/>
+              </w:rPr>
+              <w:t>employer</w:t>
+            </w:r>
+          </w:p>
+        </w:tc>
+        <w:tc>
+          <w:tcPr>
+            <w:tcW w:type="dxa" w:w="2128"/>
+          </w:tcPr>
+          <w:p>
+            <w:pPr>
+              <w:spacing w:after="0"/>
+            </w:pPr>
+            <w:r>
+              <w:rPr>
+                <w:sz w:val="19"/>
+              </w:rPr>
+              <w:t>free</w:t>
+            </w:r>
+          </w:p>
+        </w:tc>
+        <w:tc>
+          <w:tcPr>
+            <w:tcW w:type="dxa" w:w="2128"/>
+          </w:tcPr>
+          <w:p>
+            <w:pPr>
+              <w:spacing w:after="0"/>
+            </w:pPr>
+            <w:hyperlink r:id="rId90">
+              <w:r>
+                <w:rPr>
+                  <w:color w:val="7F1D3A"/>
+                  <w:u w:val="single"/>
+                  <w:sz w:val="19"/>
+                </w:rPr>
+                <w:t xml:space="preserve">jobs.mastech.com/</w:t>
+              </w:r>
+            </w:hyperlink>
+          </w:p>
+        </w:tc>
+        <w:tc>
+          <w:tcPr>
+            <w:tcW w:type="dxa" w:w="2128"/>
+          </w:tcPr>
+          <w:p>
+            <w:pPr>
+              <w:spacing w:after="0"/>
+            </w:pPr>
+            <w:r>
+              <w:rPr>
+                <w:sz w:val="19"/>
+              </w:rPr>
+              <w:t>US–India IT consultant staffing</w:t>
+            </w:r>
+          </w:p>
+        </w:tc>
+      </w:tr>
+      <w:tr>
+        <w:tc>
+          <w:tcPr>
+            <w:tcW w:type="dxa" w:w="2128"/>
+          </w:tcPr>
+          <w:p>
+            <w:pPr>
+              <w:spacing w:after="0"/>
+            </w:pPr>
+            <w:r>
+              <w:rPr>
+                <w:b/>
+                <w:sz w:val="19"/>
+              </w:rPr>
+              <w:t>LanceSoft</w:t>
+            </w:r>
+          </w:p>
+        </w:tc>
+        <w:tc>
+          <w:tcPr>
+            <w:tcW w:type="dxa" w:w="2128"/>
+          </w:tcPr>
+          <w:p>
+            <w:pPr>
+              <w:spacing w:after="0"/>
+            </w:pPr>
+            <w:r>
+              <w:rPr>
+                <w:sz w:val="19"/>
+              </w:rPr>
+              <w:t>employer</w:t>
+            </w:r>
+          </w:p>
+        </w:tc>
+        <w:tc>
+          <w:tcPr>
+            <w:tcW w:type="dxa" w:w="2128"/>
+          </w:tcPr>
+          <w:p>
+            <w:pPr>
+              <w:spacing w:after="0"/>
+            </w:pPr>
+            <w:r>
+              <w:rPr>
+                <w:sz w:val="19"/>
+              </w:rPr>
+              <w:t>free</w:t>
+            </w:r>
+          </w:p>
+        </w:tc>
+        <w:tc>
+          <w:tcPr>
+            <w:tcW w:type="dxa" w:w="2128"/>
+          </w:tcPr>
+          <w:p>
+            <w:pPr>
+              <w:spacing w:after="0"/>
+            </w:pPr>
+            <w:hyperlink r:id="rId91">
+              <w:r>
+                <w:rPr>
+                  <w:color w:val="7F1D3A"/>
+                  <w:u w:val="single"/>
+                  <w:sz w:val="19"/>
+                </w:rPr>
+                <w:t xml:space="preserve">www.lancesoft.com/jobs</w:t>
+              </w:r>
+            </w:hyperlink>
+          </w:p>
+        </w:tc>
+        <w:tc>
+          <w:tcPr>
+            <w:tcW w:type="dxa" w:w="2128"/>
+          </w:tcPr>
+          <w:p>
+            <w:pPr>
+              <w:spacing w:after="0"/>
+            </w:pPr>
+            <w:r>
+              <w:rPr>
+                <w:sz w:val="19"/>
+              </w:rPr>
+              <w:t>50+ countries; contract IT</w:t>
+            </w:r>
+          </w:p>
+        </w:tc>
+      </w:tr>
+      <w:tr>
+        <w:tc>
+          <w:tcPr>
+            <w:tcW w:type="dxa" w:w="2128"/>
+          </w:tcPr>
+          <w:p>
+            <w:pPr>
+              <w:spacing w:after="0"/>
+            </w:pPr>
+            <w:r>
+              <w:rPr>
+                <w:b/>
+                <w:sz w:val="19"/>
+              </w:rPr>
+              <w:t>NLB Services</w:t>
+            </w:r>
+          </w:p>
+        </w:tc>
+        <w:tc>
+          <w:tcPr>
+            <w:tcW w:type="dxa" w:w="2128"/>
+          </w:tcPr>
+          <w:p>
+            <w:pPr>
+              <w:spacing w:after="0"/>
+            </w:pPr>
+            <w:r>
+              <w:rPr>
+                <w:sz w:val="19"/>
+              </w:rPr>
+              <w:t>employer</w:t>
+            </w:r>
+          </w:p>
+        </w:tc>
+        <w:tc>
+          <w:tcPr>
+            <w:tcW w:type="dxa" w:w="2128"/>
+          </w:tcPr>
+          <w:p>
+            <w:pPr>
+              <w:spacing w:after="0"/>
+            </w:pPr>
+            <w:r>
+              <w:rPr>
+                <w:sz w:val="19"/>
+              </w:rPr>
+              <w:t>free</w:t>
+            </w:r>
+          </w:p>
+        </w:tc>
+        <w:tc>
+          <w:tcPr>
+            <w:tcW w:type="dxa" w:w="2128"/>
+          </w:tcPr>
+          <w:p>
+            <w:pPr>
+              <w:spacing w:after="0"/>
+            </w:pPr>
+            <w:hyperlink r:id="rId92">
+              <w:r>
+                <w:rPr>
+                  <w:color w:val="7F1D3A"/>
+                  <w:u w:val="single"/>
+                  <w:sz w:val="19"/>
+                </w:rPr>
+                <w:t xml:space="preserve">www.nlbservices.com/careers</w:t>
+              </w:r>
+            </w:hyperlink>
+          </w:p>
+        </w:tc>
+        <w:tc>
+          <w:tcPr>
+            <w:tcW w:type="dxa" w:w="2128"/>
+          </w:tcPr>
+          <w:p>
+            <w:pPr>
+              <w:spacing w:after="0"/>
+            </w:pPr>
+            <w:r>
+              <w:rPr>
+                <w:sz w:val="19"/>
+              </w:rPr>
+              <w:t>India–US IT staffing</w:t>
+            </w:r>
+          </w:p>
+        </w:tc>
+      </w:tr>
+      <w:tr>
+        <w:tc>
+          <w:tcPr>
+            <w:tcW w:type="dxa" w:w="2128"/>
+          </w:tcPr>
+          <w:p>
+            <w:pPr>
+              <w:spacing w:after="0"/>
+            </w:pPr>
+            <w:r>
+              <w:rPr>
+                <w:b/>
+                <w:sz w:val="19"/>
+              </w:rPr>
+              <w:t>Taggd</w:t>
+            </w:r>
+            <w:r>
+              <w:rPr>
+                <w:sz w:val="19"/>
+              </w:rPr>
+              <w:t xml:space="preserve"> (PeopleStrong RPO)</w:t>
+            </w:r>
+          </w:p>
+        </w:tc>
+        <w:tc>
+          <w:tcPr>
+            <w:tcW w:type="dxa" w:w="2128"/>
+          </w:tcPr>
+          <w:p>
+            <w:pPr>
+              <w:spacing w:after="0"/>
+            </w:pPr>
+            <w:r>
+              <w:rPr>
+                <w:sz w:val="19"/>
+              </w:rPr>
+              <w:t>employer</w:t>
+            </w:r>
+          </w:p>
+        </w:tc>
+        <w:tc>
+          <w:tcPr>
+            <w:tcW w:type="dxa" w:w="2128"/>
+          </w:tcPr>
+          <w:p>
+            <w:pPr>
+              <w:spacing w:after="0"/>
+            </w:pPr>
+            <w:r>
+              <w:rPr>
+                <w:sz w:val="19"/>
+              </w:rPr>
+              <w:t>free</w:t>
+            </w:r>
+          </w:p>
+        </w:tc>
+        <w:tc>
+          <w:tcPr>
+            <w:tcW w:type="dxa" w:w="2128"/>
+          </w:tcPr>
+          <w:p>
+            <w:pPr>
+              <w:spacing w:after="0"/>
+            </w:pPr>
+            <w:hyperlink r:id="rId93">
+              <w:r>
+                <w:rPr>
+                  <w:color w:val="7F1D3A"/>
+                  <w:u w:val="single"/>
+                  <w:sz w:val="19"/>
+                </w:rPr>
+                <w:t xml:space="preserve">taggd.in/careers/</w:t>
+              </w:r>
+            </w:hyperlink>
+            <w:r>
+              <w:rPr>
+                <w:sz w:val="19"/>
+              </w:rPr>
+              <w:t xml:space="preserve"> · </w:t>
+            </w:r>
+            <w:r>
+              <w:rPr>
+                <w:rFonts w:ascii="Consolas" w:hAnsi="Consolas"/>
+                <w:sz w:val="17"/>
+              </w:rPr>
+              <w:t>contact@taggd.in</w:t>
+            </w:r>
+            <w:r>
+              <w:rPr>
+                <w:sz w:val="19"/>
+              </w:rPr>
+              <w:t xml:space="preserve"> · </w:t>
+            </w:r>
+            <w:r>
+              <w:rPr>
+                <w:rFonts w:ascii="Consolas" w:hAnsi="Consolas"/>
+                <w:sz w:val="17"/>
+              </w:rPr>
+              <w:t>+91 124 442 7070</w:t>
+            </w:r>
+          </w:p>
+        </w:tc>
+        <w:tc>
+          <w:tcPr>
+            <w:tcW w:type="dxa" w:w="2128"/>
+          </w:tcPr>
+          <w:p>
+            <w:pPr>
+              <w:spacing w:after="0"/>
+            </w:pPr>
+            <w:r>
+              <w:rPr>
+                <w:sz w:val="19"/>
+              </w:rPr>
+              <w:t>Gurugram; has a dedicated software-developers function</w:t>
+            </w:r>
+          </w:p>
+        </w:tc>
+      </w:tr>
+      <w:tr>
+        <w:tc>
+          <w:tcPr>
+            <w:tcW w:type="dxa" w:w="2128"/>
+          </w:tcPr>
+          <w:p>
+            <w:pPr>
+              <w:spacing w:after="0"/>
+            </w:pPr>
+            <w:r>
+              <w:rPr>
+                <w:b/>
+                <w:sz w:val="19"/>
+              </w:rPr>
+              <w:t>Mancer Consulting</w:t>
+            </w:r>
+          </w:p>
+        </w:tc>
+        <w:tc>
+          <w:tcPr>
+            <w:tcW w:type="dxa" w:w="2128"/>
+          </w:tcPr>
+          <w:p>
+            <w:pPr>
+              <w:spacing w:after="0"/>
+            </w:pPr>
+            <w:r>
+              <w:rPr>
+                <w:sz w:val="19"/>
+              </w:rPr>
+              <w:t>employer</w:t>
+            </w:r>
+          </w:p>
+        </w:tc>
+        <w:tc>
+          <w:tcPr>
+            <w:tcW w:type="dxa" w:w="2128"/>
+          </w:tcPr>
+          <w:p>
+            <w:pPr>
+              <w:spacing w:after="0"/>
+            </w:pPr>
+            <w:r>
+              <w:rPr>
+                <w:sz w:val="19"/>
+              </w:rPr>
+              <w:t>free</w:t>
+            </w:r>
+          </w:p>
+        </w:tc>
+        <w:tc>
+          <w:tcPr>
+            <w:tcW w:type="dxa" w:w="2128"/>
+          </w:tcPr>
+          <w:p>
+            <w:pPr>
+              <w:spacing w:after="0"/>
+            </w:pPr>
+            <w:hyperlink r:id="rId94">
+              <w:r>
+                <w:rPr>
+                  <w:color w:val="7F1D3A"/>
+                  <w:u w:val="single"/>
+                  <w:sz w:val="19"/>
+                </w:rPr>
+                <w:t xml:space="preserve">www.mancerconsulting.com/job-openings/</w:t>
+              </w:r>
+            </w:hyperlink>
+            <w:r>
+              <w:rPr>
+                <w:sz w:val="19"/>
+              </w:rPr>
+              <w:t xml:space="preserve"> · </w:t>
+            </w:r>
+            <w:r>
+              <w:rPr>
+                <w:rFonts w:ascii="Consolas" w:hAnsi="Consolas"/>
+                <w:sz w:val="17"/>
+              </w:rPr>
+              <w:t>info@mancerconsulting.com</w:t>
+            </w:r>
+          </w:p>
+        </w:tc>
+        <w:tc>
+          <w:tcPr>
+            <w:tcW w:type="dxa" w:w="2128"/>
+          </w:tcPr>
+          <w:p>
+            <w:pPr>
+              <w:spacing w:after="0"/>
+            </w:pPr>
+            <w:r>
+              <w:rPr>
+                <w:sz w:val="19"/>
+              </w:rPr>
+              <w:t>Technology / Digital practice</w:t>
+            </w:r>
+          </w:p>
+        </w:tc>
+      </w:tr>
+    </w:tbl>
+    <w:p/>
+    <w:p>
+      <w:pPr>
+        <w:pStyle w:val="Heading2"/>
+      </w:pPr>
+      <w:r>
+        <w:t>Remote marketplaces</w:t>
+      </w:r>
+    </w:p>
+    <w:tbl>
+      <w:tblPr>
+        <w:tblStyle w:val="TableGrid"/>
+        <w:tblW w:type="auto" w:w="0"/>
+        <w:jc w:val="center"/>
+        <w:tblLook w:firstColumn="1" w:firstRow="1" w:lastColumn="0" w:lastRow="0" w:noHBand="0" w:noVBand="1" w:val="04A0"/>
+      </w:tblPr>
+      <w:tblGrid>
+        <w:gridCol w:w="2128"/>
+        <w:gridCol w:w="2128"/>
+        <w:gridCol w:w="2128"/>
+        <w:gridCol w:w="2128"/>
+        <w:gridCol w:w="2128"/>
+      </w:tblGrid>
+      <w:tr>
+        <w:tc>
+          <w:tcPr>
+            <w:tcW w:type="dxa" w:w="2128"/>
+            <w:shd w:val="clear" w:color="auto" w:fill="F5F5F4"/>
+          </w:tcPr>
+          <w:p>
+            <w:pPr>
+              <w:spacing w:after="0"/>
+            </w:pPr>
+            <w:r>
+              <w:rPr>
+                <w:b/>
+                <w:sz w:val="19"/>
+              </w:rPr>
+              <w:t>firm</w:t>
+            </w:r>
+          </w:p>
+        </w:tc>
+        <w:tc>
+          <w:tcPr>
+            <w:tcW w:type="dxa" w:w="2128"/>
+            <w:shd w:val="clear" w:color="auto" w:fill="F5F5F4"/>
+          </w:tcPr>
+          <w:p>
+            <w:pPr>
+              <w:spacing w:after="0"/>
+            </w:pPr>
+            <w:r>
+              <w:rPr>
+                <w:b/>
+                <w:sz w:val="19"/>
+              </w:rPr>
+              <w:t>who pays</w:t>
+            </w:r>
+          </w:p>
+        </w:tc>
+        <w:tc>
+          <w:tcPr>
+            <w:tcW w:type="dxa" w:w="2128"/>
+            <w:shd w:val="clear" w:color="auto" w:fill="F5F5F4"/>
+          </w:tcPr>
+          <w:p>
+            <w:pPr>
+              <w:spacing w:after="0"/>
+            </w:pPr>
+            <w:r>
+              <w:rPr>
+                <w:b/>
+                <w:sz w:val="19"/>
+              </w:rPr>
+              <w:t>fee</w:t>
+            </w:r>
+          </w:p>
+        </w:tc>
+        <w:tc>
+          <w:tcPr>
+            <w:tcW w:type="dxa" w:w="2128"/>
+            <w:shd w:val="clear" w:color="auto" w:fill="F5F5F4"/>
+          </w:tcPr>
+          <w:p>
+            <w:pPr>
+              <w:spacing w:after="0"/>
+            </w:pPr>
+            <w:r>
+              <w:rPr>
+                <w:b/>
+                <w:sz w:val="19"/>
+              </w:rPr>
+              <w:t>register</w:t>
+            </w:r>
+          </w:p>
+        </w:tc>
+        <w:tc>
+          <w:tcPr>
+            <w:tcW w:type="dxa" w:w="2128"/>
+            <w:shd w:val="clear" w:color="auto" w:fill="F5F5F4"/>
+          </w:tcPr>
+          <w:p>
+            <w:pPr>
+              <w:spacing w:after="0"/>
+            </w:pPr>
+            <w:r>
+              <w:rPr>
+                <w:b/>
+                <w:sz w:val="19"/>
+              </w:rPr>
+              <w:t>fit</w:t>
+            </w:r>
+          </w:p>
+        </w:tc>
+      </w:tr>
+      <w:tr>
+        <w:tc>
+          <w:tcPr>
+            <w:tcW w:type="dxa" w:w="2128"/>
+          </w:tcPr>
+          <w:p>
+            <w:pPr>
+              <w:spacing w:after="0"/>
+            </w:pPr>
+            <w:r>
+              <w:rPr>
+                <w:b/>
+                <w:sz w:val="19"/>
+              </w:rPr>
+              <w:t>Index.dev</w:t>
+            </w:r>
+          </w:p>
+        </w:tc>
+        <w:tc>
+          <w:tcPr>
+            <w:tcW w:type="dxa" w:w="2128"/>
+          </w:tcPr>
+          <w:p>
+            <w:pPr>
+              <w:spacing w:after="0"/>
+            </w:pPr>
+            <w:r>
+              <w:rPr>
+                <w:sz w:val="19"/>
+              </w:rPr>
+              <w:t>employer, "pay only when you hire"</w:t>
+            </w:r>
+          </w:p>
+        </w:tc>
+        <w:tc>
+          <w:tcPr>
+            <w:tcW w:type="dxa" w:w="2128"/>
+          </w:tcPr>
+          <w:p>
+            <w:pPr>
+              <w:spacing w:after="0"/>
+            </w:pPr>
+            <w:r>
+              <w:rPr>
+                <w:sz w:val="19"/>
+              </w:rPr>
+              <w:t>free to developers</w:t>
+            </w:r>
+          </w:p>
+        </w:tc>
+        <w:tc>
+          <w:tcPr>
+            <w:tcW w:type="dxa" w:w="2128"/>
+          </w:tcPr>
+          <w:p>
+            <w:pPr>
+              <w:spacing w:after="0"/>
+            </w:pPr>
+            <w:hyperlink r:id="rId95">
+              <w:r>
+                <w:rPr>
+                  <w:color w:val="7F1D3A"/>
+                  <w:u w:val="single"/>
+                  <w:sz w:val="19"/>
+                </w:rPr>
+                <w:t xml:space="preserve">workspace.index.dev/register</w:t>
+              </w:r>
+            </w:hyperlink>
+          </w:p>
+        </w:tc>
+        <w:tc>
+          <w:tcPr>
+            <w:tcW w:type="dxa" w:w="2128"/>
+          </w:tcPr>
+          <w:p>
+            <w:pPr>
+              <w:spacing w:after="0"/>
+            </w:pPr>
+            <w:r>
+              <w:rPr>
+                <w:sz w:val="19"/>
+              </w:rPr>
+              <w:t>engineers, global; Europe-weighted</w:t>
+            </w:r>
+          </w:p>
+        </w:tc>
+      </w:tr>
+      <w:tr>
+        <w:tc>
+          <w:tcPr>
+            <w:tcW w:type="dxa" w:w="2128"/>
+          </w:tcPr>
+          <w:p>
+            <w:pPr>
+              <w:spacing w:after="0"/>
+            </w:pPr>
+            <w:r>
+              <w:rPr>
+                <w:b/>
+                <w:sz w:val="19"/>
+              </w:rPr>
+              <w:t>Torc</w:t>
+            </w:r>
+            <w:r>
+              <w:rPr>
+                <w:sz w:val="19"/>
+              </w:rPr>
+              <w:t xml:space="preserve"> (Randstad Digital's talent community)</w:t>
+            </w:r>
+          </w:p>
+        </w:tc>
+        <w:tc>
+          <w:tcPr>
+            <w:tcW w:type="dxa" w:w="2128"/>
+          </w:tcPr>
+          <w:p>
+            <w:pPr>
+              <w:spacing w:after="0"/>
+            </w:pPr>
+            <w:r>
+              <w:rPr>
+                <w:sz w:val="19"/>
+              </w:rPr>
+              <w:t>employer</w:t>
+            </w:r>
+          </w:p>
+        </w:tc>
+        <w:tc>
+          <w:tcPr>
+            <w:tcW w:type="dxa" w:w="2128"/>
+          </w:tcPr>
+          <w:p>
+            <w:pPr>
+              <w:spacing w:after="0"/>
+            </w:pPr>
+            <w:r>
+              <w:rPr>
+                <w:sz w:val="19"/>
+              </w:rPr>
+              <w:t>free</w:t>
+            </w:r>
+          </w:p>
+        </w:tc>
+        <w:tc>
+          <w:tcPr>
+            <w:tcW w:type="dxa" w:w="2128"/>
+          </w:tcPr>
+          <w:p>
+            <w:pPr>
+              <w:spacing w:after="0"/>
+            </w:pPr>
+            <w:hyperlink r:id="rId96">
+              <w:r>
+                <w:rPr>
+                  <w:color w:val="7F1D3A"/>
+                  <w:u w:val="single"/>
+                  <w:sz w:val="19"/>
+                </w:rPr>
+                <w:t xml:space="preserve">www.torc.dev/</w:t>
+              </w:r>
+            </w:hyperlink>
+          </w:p>
+        </w:tc>
+        <w:tc>
+          <w:tcPr>
+            <w:tcW w:type="dxa" w:w="2128"/>
+          </w:tcPr>
+          <w:p>
+            <w:pPr>
+              <w:spacing w:after="0"/>
+            </w:pPr>
+            <w:r>
+              <w:rPr>
+                <w:sz w:val="19"/>
+              </w:rPr>
+              <w:t>remote engineering roles via Randstad Digital</w:t>
+            </w:r>
+          </w:p>
+        </w:tc>
+      </w:tr>
+      <w:tr>
+        <w:tc>
+          <w:tcPr>
+            <w:tcW w:type="dxa" w:w="2128"/>
+          </w:tcPr>
+          <w:p>
+            <w:pPr>
+              <w:spacing w:after="0"/>
+            </w:pPr>
+            <w:r>
+              <w:rPr>
+                <w:b/>
+                <w:sz w:val="19"/>
+              </w:rPr>
+              <w:t>VanHack</w:t>
+            </w:r>
+          </w:p>
+        </w:tc>
+        <w:tc>
+          <w:tcPr>
+            <w:tcW w:type="dxa" w:w="2128"/>
+          </w:tcPr>
+          <w:p>
+            <w:pPr>
+              <w:spacing w:after="0"/>
+            </w:pPr>
+            <w:r>
+              <w:rPr>
+                <w:sz w:val="19"/>
+              </w:rPr>
+              <w:t xml:space="preserve">employer, </w:t>
+            </w:r>
+            <w:r>
+              <w:rPr>
+                <w:rFonts w:ascii="Consolas" w:hAnsi="Consolas"/>
+                <w:sz w:val="17"/>
+              </w:rPr>
+              <w:t>$3K/month</w:t>
+            </w:r>
+            <w:r>
+              <w:rPr>
+                <w:sz w:val="19"/>
+              </w:rPr>
+              <w:t xml:space="preserve"> flat to employers</w:t>
+            </w:r>
+          </w:p>
+        </w:tc>
+        <w:tc>
+          <w:tcPr>
+            <w:tcW w:type="dxa" w:w="2128"/>
+          </w:tcPr>
+          <w:p>
+            <w:pPr>
+              <w:spacing w:after="0"/>
+            </w:pPr>
+            <w:r>
+              <w:rPr>
+                <w:sz w:val="19"/>
+              </w:rPr>
+              <w:t>not stated for developers</w:t>
+            </w:r>
+          </w:p>
+        </w:tc>
+        <w:tc>
+          <w:tcPr>
+            <w:tcW w:type="dxa" w:w="2128"/>
+          </w:tcPr>
+          <w:p>
+            <w:pPr>
+              <w:spacing w:after="0"/>
+            </w:pPr>
+            <w:hyperlink r:id="rId97">
+              <w:r>
+                <w:rPr>
+                  <w:color w:val="7F1D3A"/>
+                  <w:u w:val="single"/>
+                  <w:sz w:val="19"/>
+                </w:rPr>
+                <w:t xml:space="preserve">app.vanhack.com/jobs</w:t>
+              </w:r>
+            </w:hyperlink>
+          </w:p>
+        </w:tc>
+        <w:tc>
+          <w:tcPr>
+            <w:tcW w:type="dxa" w:w="2128"/>
+          </w:tcPr>
+          <w:p>
+            <w:pPr>
+              <w:spacing w:after="0"/>
+            </w:pPr>
+            <w:r>
+              <w:rPr>
+                <w:sz w:val="19"/>
+              </w:rPr>
+              <w:t>relocation to Canada and Europe; worth it only if relocation is on the table</w:t>
+            </w:r>
+          </w:p>
+        </w:tc>
+      </w:tr>
+      <w:tr>
+        <w:tc>
+          <w:tcPr>
+            <w:tcW w:type="dxa" w:w="2128"/>
+          </w:tcPr>
+          <w:p>
+            <w:pPr>
+              <w:spacing w:after="0"/>
+            </w:pPr>
+            <w:r>
+              <w:rPr>
+                <w:b/>
+                <w:sz w:val="19"/>
+              </w:rPr>
+              <w:t>Mercor</w:t>
+            </w:r>
+          </w:p>
+        </w:tc>
+        <w:tc>
+          <w:tcPr>
+            <w:tcW w:type="dxa" w:w="2128"/>
+          </w:tcPr>
+          <w:p>
+            <w:pPr>
+              <w:spacing w:after="0"/>
+            </w:pPr>
+            <w:r>
+              <w:rPr>
+                <w:sz w:val="19"/>
+              </w:rPr>
+              <w:t>employer</w:t>
+            </w:r>
+          </w:p>
+        </w:tc>
+        <w:tc>
+          <w:tcPr>
+            <w:tcW w:type="dxa" w:w="2128"/>
+          </w:tcPr>
+          <w:p>
+            <w:pPr>
+              <w:spacing w:after="0"/>
+            </w:pPr>
+            <w:r>
+              <w:rPr>
+                <w:sz w:val="19"/>
+              </w:rPr>
+              <w:t xml:space="preserve">pays </w:t>
+            </w:r>
+            <w:r>
+              <w:rPr>
+                <w:rFonts w:ascii="Consolas" w:hAnsi="Consolas"/>
+                <w:sz w:val="17"/>
+              </w:rPr>
+              <w:t>$60–$102/hr</w:t>
+            </w:r>
+            <w:r>
+              <w:rPr>
+                <w:sz w:val="19"/>
+              </w:rPr>
+              <w:t xml:space="preserve"> to experts</w:t>
+            </w:r>
+          </w:p>
+        </w:tc>
+        <w:tc>
+          <w:tcPr>
+            <w:tcW w:type="dxa" w:w="2128"/>
+          </w:tcPr>
+          <w:p>
+            <w:pPr>
+              <w:spacing w:after="0"/>
+            </w:pPr>
+            <w:hyperlink r:id="rId98">
+              <w:r>
+                <w:rPr>
+                  <w:color w:val="7F1D3A"/>
+                  <w:u w:val="single"/>
+                  <w:sz w:val="19"/>
+                </w:rPr>
+                <w:t xml:space="preserve">work.mercor.com/explore</w:t>
+              </w:r>
+            </w:hyperlink>
+          </w:p>
+        </w:tc>
+        <w:tc>
+          <w:tcPr>
+            <w:tcW w:type="dxa" w:w="2128"/>
+          </w:tcPr>
+          <w:p>
+            <w:pPr>
+              <w:spacing w:after="0"/>
+            </w:pPr>
+            <w:r>
+              <w:rPr>
+                <w:sz w:val="19"/>
+              </w:rPr>
+              <w:t>AI-training and evaluation gigs for engineers and domain experts, not full-stack roles; a side channel, not a job search</w:t>
+            </w:r>
+          </w:p>
+        </w:tc>
+      </w:tr>
+    </w:tbl>
+    <w:p/>
+    <w:p>
+      <w:pPr>
+        <w:pStyle w:val="Heading2"/>
+      </w:pPr>
+      <w:r>
+        <w:t>Gulf</w:t>
+      </w:r>
+    </w:p>
+    <w:tbl>
+      <w:tblPr>
+        <w:tblStyle w:val="TableGrid"/>
+        <w:tblW w:type="auto" w:w="0"/>
+        <w:jc w:val="center"/>
+        <w:tblLook w:firstColumn="1" w:firstRow="1" w:lastColumn="0" w:lastRow="0" w:noHBand="0" w:noVBand="1" w:val="04A0"/>
+      </w:tblPr>
+      <w:tblGrid>
+        <w:gridCol w:w="2128"/>
+        <w:gridCol w:w="2128"/>
+        <w:gridCol w:w="2128"/>
+        <w:gridCol w:w="2128"/>
+        <w:gridCol w:w="2128"/>
+      </w:tblGrid>
+      <w:tr>
+        <w:tc>
+          <w:tcPr>
+            <w:tcW w:type="dxa" w:w="2128"/>
+            <w:shd w:val="clear" w:color="auto" w:fill="F5F5F4"/>
+          </w:tcPr>
+          <w:p>
+            <w:pPr>
+              <w:spacing w:after="0"/>
+            </w:pPr>
+            <w:r>
+              <w:rPr>
+                <w:b/>
+                <w:sz w:val="19"/>
+              </w:rPr>
+              <w:t>firm</w:t>
+            </w:r>
+          </w:p>
+        </w:tc>
+        <w:tc>
+          <w:tcPr>
+            <w:tcW w:type="dxa" w:w="2128"/>
+            <w:shd w:val="clear" w:color="auto" w:fill="F5F5F4"/>
+          </w:tcPr>
+          <w:p>
+            <w:pPr>
+              <w:spacing w:after="0"/>
+            </w:pPr>
+            <w:r>
+              <w:rPr>
+                <w:b/>
+                <w:sz w:val="19"/>
+              </w:rPr>
+              <w:t>who pays</w:t>
+            </w:r>
+          </w:p>
+        </w:tc>
+        <w:tc>
+          <w:tcPr>
+            <w:tcW w:type="dxa" w:w="2128"/>
+            <w:shd w:val="clear" w:color="auto" w:fill="F5F5F4"/>
+          </w:tcPr>
+          <w:p>
+            <w:pPr>
+              <w:spacing w:after="0"/>
+            </w:pPr>
+            <w:r>
+              <w:rPr>
+                <w:b/>
+                <w:sz w:val="19"/>
+              </w:rPr>
+              <w:t>fee</w:t>
+            </w:r>
+          </w:p>
+        </w:tc>
+        <w:tc>
+          <w:tcPr>
+            <w:tcW w:type="dxa" w:w="2128"/>
+            <w:shd w:val="clear" w:color="auto" w:fill="F5F5F4"/>
+          </w:tcPr>
+          <w:p>
+            <w:pPr>
+              <w:spacing w:after="0"/>
+            </w:pPr>
+            <w:r>
+              <w:rPr>
+                <w:b/>
+                <w:sz w:val="19"/>
+              </w:rPr>
+              <w:t>register</w:t>
+            </w:r>
+          </w:p>
+        </w:tc>
+        <w:tc>
+          <w:tcPr>
+            <w:tcW w:type="dxa" w:w="2128"/>
+            <w:shd w:val="clear" w:color="auto" w:fill="F5F5F4"/>
+          </w:tcPr>
+          <w:p>
+            <w:pPr>
+              <w:spacing w:after="0"/>
+            </w:pPr>
+            <w:r>
+              <w:rPr>
+                <w:b/>
+                <w:sz w:val="19"/>
+              </w:rPr>
+              <w:t>fit</w:t>
+            </w:r>
+          </w:p>
+        </w:tc>
+      </w:tr>
+      <w:tr>
+        <w:tc>
+          <w:tcPr>
+            <w:tcW w:type="dxa" w:w="2128"/>
+          </w:tcPr>
+          <w:p>
+            <w:pPr>
+              <w:spacing w:after="0"/>
+            </w:pPr>
+            <w:r>
+              <w:rPr>
+                <w:b/>
+                <w:sz w:val="19"/>
+              </w:rPr>
+              <w:t>Caliberly</w:t>
+            </w:r>
+          </w:p>
+        </w:tc>
+        <w:tc>
+          <w:tcPr>
+            <w:tcW w:type="dxa" w:w="2128"/>
+          </w:tcPr>
+          <w:p>
+            <w:pPr>
+              <w:spacing w:after="0"/>
+            </w:pPr>
+            <w:r>
+              <w:rPr>
+                <w:sz w:val="19"/>
+              </w:rPr>
+              <w:t>employer, "we do not charge candidates for job placements"</w:t>
+            </w:r>
+          </w:p>
+        </w:tc>
+        <w:tc>
+          <w:tcPr>
+            <w:tcW w:type="dxa" w:w="2128"/>
+          </w:tcPr>
+          <w:p>
+            <w:pPr>
+              <w:spacing w:after="0"/>
+            </w:pPr>
+            <w:r>
+              <w:rPr>
+                <w:sz w:val="19"/>
+              </w:rPr>
+              <w:t>free</w:t>
+            </w:r>
+          </w:p>
+        </w:tc>
+        <w:tc>
+          <w:tcPr>
+            <w:tcW w:type="dxa" w:w="2128"/>
+          </w:tcPr>
+          <w:p>
+            <w:pPr>
+              <w:spacing w:after="0"/>
+            </w:pPr>
+            <w:hyperlink r:id="rId99">
+              <w:r>
+                <w:rPr>
+                  <w:color w:val="7F1D3A"/>
+                  <w:u w:val="single"/>
+                  <w:sz w:val="19"/>
+                </w:rPr>
+                <w:t xml:space="preserve">careers-page.com/caliberly/apply</w:t>
+              </w:r>
+            </w:hyperlink>
+            <w:r>
+              <w:rPr>
+                <w:sz w:val="19"/>
+              </w:rPr>
+              <w:t xml:space="preserve"> · </w:t>
+            </w:r>
+            <w:r>
+              <w:rPr>
+                <w:rFonts w:ascii="Consolas" w:hAnsi="Consolas"/>
+                <w:sz w:val="17"/>
+              </w:rPr>
+              <w:t>+971 4 288 6642</w:t>
+            </w:r>
+          </w:p>
+        </w:tc>
+        <w:tc>
+          <w:tcPr>
+            <w:tcW w:type="dxa" w:w="2128"/>
+          </w:tcPr>
+          <w:p>
+            <w:pPr>
+              <w:spacing w:after="0"/>
+            </w:pPr>
+            <w:r>
+              <w:rPr>
+                <w:sz w:val="19"/>
+              </w:rPr>
+              <w:t>Dubai; permanent and contract, mid to senior</w:t>
+            </w:r>
+          </w:p>
+        </w:tc>
+      </w:tr>
+      <w:tr>
+        <w:tc>
+          <w:tcPr>
+            <w:tcW w:type="dxa" w:w="2128"/>
+          </w:tcPr>
+          <w:p>
+            <w:pPr>
+              <w:spacing w:after="0"/>
+            </w:pPr>
+            <w:r>
+              <w:rPr>
+                <w:b/>
+                <w:sz w:val="19"/>
+              </w:rPr>
+              <w:t>Han Digital</w:t>
+            </w:r>
+          </w:p>
+        </w:tc>
+        <w:tc>
+          <w:tcPr>
+            <w:tcW w:type="dxa" w:w="2128"/>
+          </w:tcPr>
+          <w:p>
+            <w:pPr>
+              <w:spacing w:after="0"/>
+            </w:pPr>
+            <w:r>
+              <w:rPr>
+                <w:sz w:val="19"/>
+              </w:rPr>
+              <w:t>employer</w:t>
+            </w:r>
+          </w:p>
+        </w:tc>
+        <w:tc>
+          <w:tcPr>
+            <w:tcW w:type="dxa" w:w="2128"/>
+          </w:tcPr>
+          <w:p>
+            <w:pPr>
+              <w:spacing w:after="0"/>
+            </w:pPr>
+            <w:r>
+              <w:rPr>
+                <w:sz w:val="19"/>
+              </w:rPr>
+              <w:t>free</w:t>
+            </w:r>
+          </w:p>
+        </w:tc>
+        <w:tc>
+          <w:tcPr>
+            <w:tcW w:type="dxa" w:w="2128"/>
+          </w:tcPr>
+          <w:p>
+            <w:pPr>
+              <w:spacing w:after="0"/>
+            </w:pPr>
+            <w:r>
+              <w:rPr>
+                <w:sz w:val="19"/>
+              </w:rPr>
+              <w:t>see India table</w:t>
+            </w:r>
+          </w:p>
+        </w:tc>
+        <w:tc>
+          <w:tcPr>
+            <w:tcW w:type="dxa" w:w="2128"/>
+          </w:tcPr>
+          <w:p>
+            <w:pPr>
+              <w:spacing w:after="0"/>
+            </w:pPr>
+            <w:r>
+              <w:rPr>
+                <w:sz w:val="19"/>
+              </w:rPr>
+              <w:t>Dubai office</w:t>
+            </w:r>
+          </w:p>
+        </w:tc>
+      </w:tr>
+    </w:tbl>
+    <w:p/>
+    <w:p>
+      <w:pPr>
+        <w:pStyle w:val="Heading2"/>
+      </w:pPr>
+      <w:r>
+        <w:t>UK, Europe, US tech specialists</w:t>
+      </w:r>
+    </w:p>
+    <w:tbl>
+      <w:tblPr>
+        <w:tblStyle w:val="TableGrid"/>
+        <w:tblW w:type="auto" w:w="0"/>
+        <w:jc w:val="center"/>
+        <w:tblLook w:firstColumn="1" w:firstRow="1" w:lastColumn="0" w:lastRow="0" w:noHBand="0" w:noVBand="1" w:val="04A0"/>
+      </w:tblPr>
+      <w:tblGrid>
+        <w:gridCol w:w="2128"/>
+        <w:gridCol w:w="2128"/>
+        <w:gridCol w:w="2128"/>
+        <w:gridCol w:w="2128"/>
+        <w:gridCol w:w="2128"/>
+      </w:tblGrid>
+      <w:tr>
+        <w:tc>
+          <w:tcPr>
+            <w:tcW w:type="dxa" w:w="2128"/>
+            <w:shd w:val="clear" w:color="auto" w:fill="F5F5F4"/>
+          </w:tcPr>
+          <w:p>
+            <w:pPr>
+              <w:spacing w:after="0"/>
+            </w:pPr>
+            <w:r>
+              <w:rPr>
+                <w:b/>
+                <w:sz w:val="19"/>
+              </w:rPr>
+              <w:t>firm</w:t>
+            </w:r>
+          </w:p>
+        </w:tc>
+        <w:tc>
+          <w:tcPr>
+            <w:tcW w:type="dxa" w:w="2128"/>
+            <w:shd w:val="clear" w:color="auto" w:fill="F5F5F4"/>
+          </w:tcPr>
+          <w:p>
+            <w:pPr>
+              <w:spacing w:after="0"/>
+            </w:pPr>
+            <w:r>
+              <w:rPr>
+                <w:b/>
+                <w:sz w:val="19"/>
+              </w:rPr>
+              <w:t>who pays</w:t>
+            </w:r>
+          </w:p>
+        </w:tc>
+        <w:tc>
+          <w:tcPr>
+            <w:tcW w:type="dxa" w:w="2128"/>
+            <w:shd w:val="clear" w:color="auto" w:fill="F5F5F4"/>
+          </w:tcPr>
+          <w:p>
+            <w:pPr>
+              <w:spacing w:after="0"/>
+            </w:pPr>
+            <w:r>
+              <w:rPr>
+                <w:b/>
+                <w:sz w:val="19"/>
+              </w:rPr>
+              <w:t>fee</w:t>
+            </w:r>
+          </w:p>
+        </w:tc>
+        <w:tc>
+          <w:tcPr>
+            <w:tcW w:type="dxa" w:w="2128"/>
+            <w:shd w:val="clear" w:color="auto" w:fill="F5F5F4"/>
+          </w:tcPr>
+          <w:p>
+            <w:pPr>
+              <w:spacing w:after="0"/>
+            </w:pPr>
+            <w:r>
+              <w:rPr>
+                <w:b/>
+                <w:sz w:val="19"/>
+              </w:rPr>
+              <w:t>register</w:t>
+            </w:r>
+          </w:p>
+        </w:tc>
+        <w:tc>
+          <w:tcPr>
+            <w:tcW w:type="dxa" w:w="2128"/>
+            <w:shd w:val="clear" w:color="auto" w:fill="F5F5F4"/>
+          </w:tcPr>
+          <w:p>
+            <w:pPr>
+              <w:spacing w:after="0"/>
+            </w:pPr>
+            <w:r>
+              <w:rPr>
+                <w:b/>
+                <w:sz w:val="19"/>
+              </w:rPr>
+              <w:t>fit</w:t>
+            </w:r>
+          </w:p>
+        </w:tc>
+      </w:tr>
+      <w:tr>
+        <w:tc>
+          <w:tcPr>
+            <w:tcW w:type="dxa" w:w="2128"/>
+          </w:tcPr>
+          <w:p>
+            <w:pPr>
+              <w:spacing w:after="0"/>
+            </w:pPr>
+            <w:r>
+              <w:rPr>
+                <w:b/>
+                <w:sz w:val="19"/>
+              </w:rPr>
+              <w:t>CyberCoders</w:t>
+            </w:r>
+          </w:p>
+        </w:tc>
+        <w:tc>
+          <w:tcPr>
+            <w:tcW w:type="dxa" w:w="2128"/>
+          </w:tcPr>
+          <w:p>
+            <w:pPr>
+              <w:spacing w:after="0"/>
+            </w:pPr>
+            <w:r>
+              <w:rPr>
+                <w:sz w:val="19"/>
+              </w:rPr>
+              <w:t>employer</w:t>
+            </w:r>
+          </w:p>
+        </w:tc>
+        <w:tc>
+          <w:tcPr>
+            <w:tcW w:type="dxa" w:w="2128"/>
+          </w:tcPr>
+          <w:p>
+            <w:pPr>
+              <w:spacing w:after="0"/>
+            </w:pPr>
+            <w:r>
+              <w:rPr>
+                <w:sz w:val="19"/>
+              </w:rPr>
+              <w:t>free</w:t>
+            </w:r>
+          </w:p>
+        </w:tc>
+        <w:tc>
+          <w:tcPr>
+            <w:tcW w:type="dxa" w:w="2128"/>
+          </w:tcPr>
+          <w:p>
+            <w:pPr>
+              <w:spacing w:after="0"/>
+            </w:pPr>
+            <w:hyperlink r:id="rId100">
+              <w:r>
+                <w:rPr>
+                  <w:color w:val="7F1D3A"/>
+                  <w:u w:val="single"/>
+                  <w:sz w:val="19"/>
+                </w:rPr>
+                <w:t xml:space="preserve">www.cybercoders.com/upload-resume</w:t>
+              </w:r>
+            </w:hyperlink>
+            <w:r>
+              <w:rPr>
+                <w:sz w:val="19"/>
+              </w:rPr>
+              <w:t xml:space="preserve"> · remote search: </w:t>
+            </w:r>
+            <w:hyperlink r:id="rId101">
+              <w:r>
+                <w:rPr>
+                  <w:color w:val="7F1D3A"/>
+                  <w:u w:val="single"/>
+                  <w:sz w:val="19"/>
+                </w:rPr>
+                <w:t xml:space="preserve">www.cybercoders.com/search?locationKeyword=remote</w:t>
+              </w:r>
+            </w:hyperlink>
+          </w:p>
+        </w:tc>
+        <w:tc>
+          <w:tcPr>
+            <w:tcW w:type="dxa" w:w="2128"/>
+          </w:tcPr>
+          <w:p>
+            <w:pPr>
+              <w:spacing w:after="0"/>
+            </w:pPr>
+            <w:r>
+              <w:rPr>
+                <w:sz w:val="19"/>
+              </w:rPr>
+              <w:t>US tech recruiter, strong remote filter</w:t>
+            </w:r>
+          </w:p>
+        </w:tc>
+      </w:tr>
+      <w:tr>
+        <w:tc>
+          <w:tcPr>
+            <w:tcW w:type="dxa" w:w="2128"/>
+          </w:tcPr>
+          <w:p>
+            <w:pPr>
+              <w:spacing w:after="0"/>
+            </w:pPr>
+            <w:r>
+              <w:rPr>
+                <w:b/>
+                <w:sz w:val="19"/>
+              </w:rPr>
+              <w:t>Harvey Nash</w:t>
+            </w:r>
+          </w:p>
+        </w:tc>
+        <w:tc>
+          <w:tcPr>
+            <w:tcW w:type="dxa" w:w="2128"/>
+          </w:tcPr>
+          <w:p>
+            <w:pPr>
+              <w:spacing w:after="0"/>
+            </w:pPr>
+            <w:r>
+              <w:rPr>
+                <w:sz w:val="19"/>
+              </w:rPr>
+              <w:t>employer</w:t>
+            </w:r>
+          </w:p>
+        </w:tc>
+        <w:tc>
+          <w:tcPr>
+            <w:tcW w:type="dxa" w:w="2128"/>
+          </w:tcPr>
+          <w:p>
+            <w:pPr>
+              <w:spacing w:after="0"/>
+            </w:pPr>
+            <w:r>
+              <w:rPr>
+                <w:sz w:val="19"/>
+              </w:rPr>
+              <w:t>free</w:t>
+            </w:r>
+          </w:p>
+        </w:tc>
+        <w:tc>
+          <w:tcPr>
+            <w:tcW w:type="dxa" w:w="2128"/>
+          </w:tcPr>
+          <w:p>
+            <w:pPr>
+              <w:spacing w:after="0"/>
+            </w:pPr>
+            <w:hyperlink r:id="rId102">
+              <w:r>
+                <w:rPr>
+                  <w:color w:val="7F1D3A"/>
+                  <w:u w:val="single"/>
+                  <w:sz w:val="19"/>
+                </w:rPr>
+                <w:t xml:space="preserve">www.harveynash.com/candidates/overview</w:t>
+              </w:r>
+            </w:hyperlink>
+          </w:p>
+        </w:tc>
+        <w:tc>
+          <w:tcPr>
+            <w:tcW w:type="dxa" w:w="2128"/>
+          </w:tcPr>
+          <w:p>
+            <w:pPr>
+              <w:spacing w:after="0"/>
+            </w:pPr>
+            <w:r>
+              <w:rPr>
+                <w:sz w:val="19"/>
+              </w:rPr>
+              <w:t>UK, IE, NL, BE, DE, PL, CA, US</w:t>
+            </w:r>
+          </w:p>
+        </w:tc>
+      </w:tr>
+      <w:tr>
+        <w:tc>
+          <w:tcPr>
+            <w:tcW w:type="dxa" w:w="2128"/>
+          </w:tcPr>
+          <w:p>
+            <w:pPr>
+              <w:spacing w:after="0"/>
+            </w:pPr>
+            <w:r>
+              <w:rPr>
+                <w:b/>
+                <w:sz w:val="19"/>
+              </w:rPr>
+              <w:t>Lorien</w:t>
+            </w:r>
+          </w:p>
+        </w:tc>
+        <w:tc>
+          <w:tcPr>
+            <w:tcW w:type="dxa" w:w="2128"/>
+          </w:tcPr>
+          <w:p>
+            <w:pPr>
+              <w:spacing w:after="0"/>
+            </w:pPr>
+            <w:r>
+              <w:rPr>
+                <w:sz w:val="19"/>
+              </w:rPr>
+              <w:t>employer</w:t>
+            </w:r>
+          </w:p>
+        </w:tc>
+        <w:tc>
+          <w:tcPr>
+            <w:tcW w:type="dxa" w:w="2128"/>
+          </w:tcPr>
+          <w:p>
+            <w:pPr>
+              <w:spacing w:after="0"/>
+            </w:pPr>
+            <w:r>
+              <w:rPr>
+                <w:sz w:val="19"/>
+              </w:rPr>
+              <w:t>free</w:t>
+            </w:r>
+          </w:p>
+        </w:tc>
+        <w:tc>
+          <w:tcPr>
+            <w:tcW w:type="dxa" w:w="2128"/>
+          </w:tcPr>
+          <w:p>
+            <w:pPr>
+              <w:spacing w:after="0"/>
+            </w:pPr>
+            <w:hyperlink r:id="rId103">
+              <w:r>
+                <w:rPr>
+                  <w:color w:val="7F1D3A"/>
+                  <w:u w:val="single"/>
+                  <w:sz w:val="19"/>
+                </w:rPr>
+                <w:t xml:space="preserve">www.lorienglobal.com/get-hired</w:t>
+              </w:r>
+            </w:hyperlink>
+            <w:r>
+              <w:rPr>
+                <w:sz w:val="19"/>
+              </w:rPr>
+              <w:t xml:space="preserve"> · jobs: </w:t>
+            </w:r>
+            <w:hyperlink r:id="rId104">
+              <w:r>
+                <w:rPr>
+                  <w:color w:val="7F1D3A"/>
+                  <w:u w:val="single"/>
+                  <w:sz w:val="19"/>
+                </w:rPr>
+                <w:t xml:space="preserve">www.lorienglobal.com/jobs</w:t>
+              </w:r>
+            </w:hyperlink>
+            <w:r>
+              <w:rPr>
+                <w:sz w:val="19"/>
+              </w:rPr>
+              <w:t xml:space="preserve"> · </w:t>
+            </w:r>
+            <w:r>
+              <w:rPr>
+                <w:rFonts w:ascii="Consolas" w:hAnsi="Consolas"/>
+                <w:sz w:val="17"/>
+              </w:rPr>
+              <w:t>info@lorienglobal.com</w:t>
+            </w:r>
+          </w:p>
+        </w:tc>
+        <w:tc>
+          <w:tcPr>
+            <w:tcW w:type="dxa" w:w="2128"/>
+          </w:tcPr>
+          <w:p>
+            <w:pPr>
+              <w:spacing w:after="0"/>
+            </w:pPr>
+            <w:r>
+              <w:rPr>
+                <w:sz w:val="19"/>
+              </w:rPr>
+              <w:t>UK, US, AU</w:t>
+            </w:r>
+          </w:p>
+        </w:tc>
+      </w:tr>
+      <w:tr>
+        <w:tc>
+          <w:tcPr>
+            <w:tcW w:type="dxa" w:w="2128"/>
+          </w:tcPr>
+          <w:p>
+            <w:pPr>
+              <w:spacing w:after="0"/>
+            </w:pPr>
+            <w:r>
+              <w:rPr>
+                <w:b/>
+                <w:sz w:val="19"/>
+              </w:rPr>
+              <w:t>Understanding Recruitment</w:t>
+            </w:r>
+          </w:p>
+        </w:tc>
+        <w:tc>
+          <w:tcPr>
+            <w:tcW w:type="dxa" w:w="2128"/>
+          </w:tcPr>
+          <w:p>
+            <w:pPr>
+              <w:spacing w:after="0"/>
+            </w:pPr>
+            <w:r>
+              <w:rPr>
+                <w:sz w:val="19"/>
+              </w:rPr>
+              <w:t>employer</w:t>
+            </w:r>
+          </w:p>
+        </w:tc>
+        <w:tc>
+          <w:tcPr>
+            <w:tcW w:type="dxa" w:w="2128"/>
+          </w:tcPr>
+          <w:p>
+            <w:pPr>
+              <w:spacing w:after="0"/>
+            </w:pPr>
+            <w:r>
+              <w:rPr>
+                <w:sz w:val="19"/>
+              </w:rPr>
+              <w:t>free</w:t>
+            </w:r>
+          </w:p>
+        </w:tc>
+        <w:tc>
+          <w:tcPr>
+            <w:tcW w:type="dxa" w:w="2128"/>
+          </w:tcPr>
+          <w:p>
+            <w:pPr>
+              <w:spacing w:after="0"/>
+            </w:pPr>
+            <w:hyperlink r:id="rId105">
+              <w:r>
+                <w:rPr>
+                  <w:color w:val="7F1D3A"/>
+                  <w:u w:val="single"/>
+                  <w:sz w:val="19"/>
+                </w:rPr>
+                <w:t xml:space="preserve">www.understandingrecruitment.com/candidates/upload-cv/</w:t>
+              </w:r>
+            </w:hyperlink>
+            <w:r>
+              <w:rPr>
+                <w:sz w:val="19"/>
+              </w:rPr>
+              <w:t xml:space="preserve"> · </w:t>
+            </w:r>
+            <w:r>
+              <w:rPr>
+                <w:rFonts w:ascii="Consolas" w:hAnsi="Consolas"/>
+                <w:sz w:val="17"/>
+              </w:rPr>
+              <w:t>info@understandingrecruitment.com</w:t>
+            </w:r>
+          </w:p>
+        </w:tc>
+        <w:tc>
+          <w:tcPr>
+            <w:tcW w:type="dxa" w:w="2128"/>
+          </w:tcPr>
+          <w:p>
+            <w:pPr>
+              <w:spacing w:after="0"/>
+            </w:pPr>
+            <w:r>
+              <w:rPr>
+                <w:sz w:val="19"/>
+              </w:rPr>
+              <w:t>UK, Europe, US; software engineering specialist</w:t>
+            </w:r>
+          </w:p>
+        </w:tc>
+      </w:tr>
+      <w:tr>
+        <w:tc>
+          <w:tcPr>
+            <w:tcW w:type="dxa" w:w="2128"/>
+          </w:tcPr>
+          <w:p>
+            <w:pPr>
+              <w:spacing w:after="0"/>
+            </w:pPr>
+            <w:r>
+              <w:rPr>
+                <w:b/>
+                <w:sz w:val="19"/>
+              </w:rPr>
+              <w:t>Trust in SODA</w:t>
+            </w:r>
+          </w:p>
+        </w:tc>
+        <w:tc>
+          <w:tcPr>
+            <w:tcW w:type="dxa" w:w="2128"/>
+          </w:tcPr>
+          <w:p>
+            <w:pPr>
+              <w:spacing w:after="0"/>
+            </w:pPr>
+            <w:r>
+              <w:rPr>
+                <w:sz w:val="19"/>
+              </w:rPr>
+              <w:t>employer</w:t>
+            </w:r>
+          </w:p>
+        </w:tc>
+        <w:tc>
+          <w:tcPr>
+            <w:tcW w:type="dxa" w:w="2128"/>
+          </w:tcPr>
+          <w:p>
+            <w:pPr>
+              <w:spacing w:after="0"/>
+            </w:pPr>
+            <w:r>
+              <w:rPr>
+                <w:sz w:val="19"/>
+              </w:rPr>
+              <w:t>free</w:t>
+            </w:r>
+          </w:p>
+        </w:tc>
+        <w:tc>
+          <w:tcPr>
+            <w:tcW w:type="dxa" w:w="2128"/>
+          </w:tcPr>
+          <w:p>
+            <w:pPr>
+              <w:spacing w:after="0"/>
+            </w:pPr>
+            <w:hyperlink r:id="rId106">
+              <w:r>
+                <w:rPr>
+                  <w:color w:val="7F1D3A"/>
+                  <w:u w:val="single"/>
+                  <w:sz w:val="19"/>
+                </w:rPr>
+                <w:t xml:space="preserve">www.trustinsoda.com/jobs</w:t>
+              </w:r>
+            </w:hyperlink>
+          </w:p>
+        </w:tc>
+        <w:tc>
+          <w:tcPr>
+            <w:tcW w:type="dxa" w:w="2128"/>
+          </w:tcPr>
+          <w:p>
+            <w:pPr>
+              <w:spacing w:after="0"/>
+            </w:pPr>
+            <w:r>
+              <w:rPr>
+                <w:sz w:val="19"/>
+              </w:rPr>
+              <w:t>DE, IE, CH, UK, US; tech only</w:t>
+            </w:r>
+          </w:p>
+        </w:tc>
+      </w:tr>
+      <w:tr>
+        <w:tc>
+          <w:tcPr>
+            <w:tcW w:type="dxa" w:w="2128"/>
+          </w:tcPr>
+          <w:p>
+            <w:pPr>
+              <w:spacing w:after="0"/>
+            </w:pPr>
+            <w:r>
+              <w:rPr>
+                <w:b/>
+                <w:sz w:val="19"/>
+              </w:rPr>
+              <w:t>Akkodis</w:t>
+            </w:r>
+          </w:p>
+        </w:tc>
+        <w:tc>
+          <w:tcPr>
+            <w:tcW w:type="dxa" w:w="2128"/>
+          </w:tcPr>
+          <w:p>
+            <w:pPr>
+              <w:spacing w:after="0"/>
+            </w:pPr>
+            <w:r>
+              <w:rPr>
+                <w:sz w:val="19"/>
+              </w:rPr>
+              <w:t>employer</w:t>
+            </w:r>
+          </w:p>
+        </w:tc>
+        <w:tc>
+          <w:tcPr>
+            <w:tcW w:type="dxa" w:w="2128"/>
+          </w:tcPr>
+          <w:p>
+            <w:pPr>
+              <w:spacing w:after="0"/>
+            </w:pPr>
+            <w:r>
+              <w:rPr>
+                <w:sz w:val="19"/>
+              </w:rPr>
+              <w:t>free</w:t>
+            </w:r>
+          </w:p>
+        </w:tc>
+        <w:tc>
+          <w:tcPr>
+            <w:tcW w:type="dxa" w:w="2128"/>
+          </w:tcPr>
+          <w:p>
+            <w:pPr>
+              <w:spacing w:after="0"/>
+            </w:pPr>
+            <w:hyperlink r:id="rId107">
+              <w:r>
+                <w:rPr>
+                  <w:color w:val="7F1D3A"/>
+                  <w:u w:val="single"/>
+                  <w:sz w:val="19"/>
+                </w:rPr>
+                <w:t xml:space="preserve">www.akkodis.com/en/careers</w:t>
+              </w:r>
+            </w:hyperlink>
+          </w:p>
+        </w:tc>
+        <w:tc>
+          <w:tcPr>
+            <w:tcW w:type="dxa" w:w="2128"/>
+          </w:tcPr>
+          <w:p>
+            <w:pPr>
+              <w:spacing w:after="0"/>
+            </w:pPr>
+            <w:r>
+              <w:rPr>
+                <w:sz w:val="19"/>
+              </w:rPr>
+              <w:t>30+ countries; engineering and IT</w:t>
+            </w:r>
+          </w:p>
+        </w:tc>
+      </w:tr>
+      <w:tr>
+        <w:tc>
+          <w:tcPr>
+            <w:tcW w:type="dxa" w:w="2128"/>
+          </w:tcPr>
+          <w:p>
+            <w:pPr>
+              <w:spacing w:after="0"/>
+            </w:pPr>
+            <w:r>
+              <w:rPr>
+                <w:b/>
+                <w:sz w:val="19"/>
+              </w:rPr>
+              <w:t>Randstad Digital</w:t>
+            </w:r>
+          </w:p>
+        </w:tc>
+        <w:tc>
+          <w:tcPr>
+            <w:tcW w:type="dxa" w:w="2128"/>
+          </w:tcPr>
+          <w:p>
+            <w:pPr>
+              <w:spacing w:after="0"/>
+            </w:pPr>
+            <w:r>
+              <w:rPr>
+                <w:sz w:val="19"/>
+              </w:rPr>
+              <w:t>employer</w:t>
+            </w:r>
+          </w:p>
+        </w:tc>
+        <w:tc>
+          <w:tcPr>
+            <w:tcW w:type="dxa" w:w="2128"/>
+          </w:tcPr>
+          <w:p>
+            <w:pPr>
+              <w:spacing w:after="0"/>
+            </w:pPr>
+            <w:r>
+              <w:rPr>
+                <w:sz w:val="19"/>
+              </w:rPr>
+              <w:t>free</w:t>
+            </w:r>
+          </w:p>
+        </w:tc>
+        <w:tc>
+          <w:tcPr>
+            <w:tcW w:type="dxa" w:w="2128"/>
+          </w:tcPr>
+          <w:p>
+            <w:pPr>
+              <w:spacing w:after="0"/>
+            </w:pPr>
+            <w:hyperlink r:id="rId108">
+              <w:r>
+                <w:rPr>
+                  <w:color w:val="7F1D3A"/>
+                  <w:u w:val="single"/>
+                  <w:sz w:val="19"/>
+                </w:rPr>
+                <w:t xml:space="preserve">www.randstaddigital.com/careers/current-opportunities/</w:t>
+              </w:r>
+            </w:hyperlink>
+          </w:p>
+        </w:tc>
+        <w:tc>
+          <w:tcPr>
+            <w:tcW w:type="dxa" w:w="2128"/>
+          </w:tcPr>
+          <w:p>
+            <w:pPr>
+              <w:spacing w:after="0"/>
+            </w:pPr>
+            <w:r>
+              <w:rPr>
+                <w:sz w:val="19"/>
+              </w:rPr>
+              <w:t>global; talent community is Torc above</w:t>
+            </w:r>
+          </w:p>
+        </w:tc>
+      </w:tr>
+    </w:tbl>
+    <w:p/>
+    <w:p>
+      <w:pPr>
+        <w:pStyle w:val="Heading2"/>
+      </w:pPr>
+      <w:r>
+        <w:t>Could not verify this round</w:t>
+      </w:r>
+    </w:p>
+    <w:tbl>
+      <w:tblPr>
+        <w:tblStyle w:val="TableGrid"/>
+        <w:tblW w:type="auto" w:w="0"/>
+        <w:jc w:val="center"/>
+        <w:tblLook w:firstColumn="1" w:firstRow="1" w:lastColumn="0" w:lastRow="0" w:noHBand="0" w:noVBand="1" w:val="04A0"/>
+      </w:tblPr>
+      <w:tblGrid>
+        <w:gridCol w:w="5320"/>
+        <w:gridCol w:w="5320"/>
+      </w:tblGrid>
+      <w:tr>
+        <w:tc>
+          <w:tcPr>
+            <w:tcW w:type="dxa" w:w="5320"/>
+            <w:shd w:val="clear" w:color="auto" w:fill="F5F5F4"/>
+          </w:tcPr>
+          <w:p>
+            <w:pPr>
+              <w:spacing w:after="0"/>
+            </w:pPr>
+            <w:r>
+              <w:rPr>
+                <w:b/>
+                <w:sz w:val="19"/>
+              </w:rPr>
+              <w:t>firm</w:t>
+            </w:r>
+          </w:p>
+        </w:tc>
+        <w:tc>
+          <w:tcPr>
+            <w:tcW w:type="dxa" w:w="5320"/>
+            <w:shd w:val="clear" w:color="auto" w:fill="F5F5F4"/>
+          </w:tcPr>
+          <w:p>
+            <w:pPr>
+              <w:spacing w:after="0"/>
+            </w:pPr>
+            <w:r>
+              <w:rPr>
+                <w:b/>
+                <w:sz w:val="19"/>
+              </w:rPr>
+              <w:t>reason</w:t>
+            </w:r>
+          </w:p>
+        </w:tc>
+      </w:tr>
+      <w:tr>
+        <w:tc>
+          <w:tcPr>
+            <w:tcW w:type="dxa" w:w="5320"/>
+          </w:tcPr>
+          <w:p>
+            <w:pPr>
+              <w:spacing w:after="0"/>
+            </w:pPr>
+            <w:r>
+              <w:rPr>
+                <w:sz w:val="19"/>
+              </w:rPr>
+              <w:t>Terminal.io</w:t>
+            </w:r>
+          </w:p>
+        </w:tc>
+        <w:tc>
+          <w:tcPr>
+            <w:tcW w:type="dxa" w:w="5320"/>
+          </w:tcPr>
+          <w:p>
+            <w:pPr>
+              <w:spacing w:after="0"/>
+            </w:pPr>
+            <w:r>
+              <w:rPr>
+                <w:sz w:val="19"/>
+              </w:rPr>
+              <w:t>HTTP 403</w:t>
+            </w:r>
+          </w:p>
+        </w:tc>
+      </w:tr>
+      <w:tr>
+        <w:tc>
+          <w:tcPr>
+            <w:tcW w:type="dxa" w:w="5320"/>
+          </w:tcPr>
+          <w:p>
+            <w:pPr>
+              <w:spacing w:after="0"/>
+            </w:pPr>
+            <w:r>
+              <w:rPr>
+                <w:sz w:val="19"/>
+              </w:rPr>
+              <w:t>Supersourcing</w:t>
+            </w:r>
+          </w:p>
+        </w:tc>
+        <w:tc>
+          <w:tcPr>
+            <w:tcW w:type="dxa" w:w="5320"/>
+          </w:tcPr>
+          <w:p>
+            <w:pPr>
+              <w:spacing w:after="0"/>
+            </w:pPr>
+            <w:r>
+              <w:rPr>
+                <w:sz w:val="19"/>
+              </w:rPr>
+              <w:t>site is employer-facing only; no developer route published</w:t>
+            </w:r>
+          </w:p>
+        </w:tc>
+      </w:tr>
+      <w:tr>
+        <w:tc>
+          <w:tcPr>
+            <w:tcW w:type="dxa" w:w="5320"/>
+          </w:tcPr>
+          <w:p>
+            <w:pPr>
+              <w:spacing w:after="0"/>
+            </w:pPr>
+            <w:r>
+              <w:rPr>
+                <w:sz w:val="19"/>
+              </w:rPr>
+              <w:t>Kelly Services India</w:t>
+            </w:r>
+          </w:p>
+        </w:tc>
+        <w:tc>
+          <w:tcPr>
+            <w:tcW w:type="dxa" w:w="5320"/>
+          </w:tcPr>
+          <w:p>
+            <w:pPr>
+              <w:spacing w:after="0"/>
+            </w:pPr>
+            <w:r>
+              <w:rPr>
+                <w:sz w:val="19"/>
+              </w:rPr>
+              <w:t>redirects to KellyOCG, an outsourcing brand with no candidate route</w:t>
+            </w:r>
+          </w:p>
+        </w:tc>
+      </w:tr>
+      <w:tr>
+        <w:tc>
+          <w:tcPr>
+            <w:tcW w:type="dxa" w:w="5320"/>
+          </w:tcPr>
+          <w:p>
+            <w:pPr>
+              <w:spacing w:after="0"/>
+            </w:pPr>
+            <w:r>
+              <w:rPr>
+                <w:b/>
+                <w:sz w:val="19"/>
+              </w:rPr>
+              <w:t>talent.io</w:t>
+            </w:r>
+          </w:p>
+        </w:tc>
+        <w:tc>
+          <w:tcPr>
+            <w:tcW w:type="dxa" w:w="5320"/>
+          </w:tcPr>
+          <w:p>
+            <w:pPr>
+              <w:spacing w:after="0"/>
+            </w:pPr>
+            <w:r>
+              <w:rPr>
+                <w:sz w:val="19"/>
+              </w:rPr>
+              <w:t xml:space="preserve">**TLS certificate is for </w:t>
+            </w:r>
+            <w:r>
+              <w:rPr>
+                <w:rFonts w:ascii="Consolas" w:hAnsi="Consolas"/>
+                <w:sz w:val="17"/>
+              </w:rPr>
+              <w:t>*.herokuapp.com</w:t>
+            </w:r>
+            <w:r>
+              <w:rPr>
+                <w:sz w:val="19"/>
+              </w:rPr>
+              <w:t>, not its hostname; do not upload a CV there**</w:t>
+            </w:r>
+          </w:p>
+        </w:tc>
+      </w:tr>
+    </w:tbl>
+    <w:p/>
+    <w:p>
+      <w:r>
+        <w:t xml:space="preserve">Total registry after this round: </w:t>
+      </w:r>
+      <w:r>
+        <w:rPr>
+          <w:b/>
+        </w:rPr>
+        <w:t>106 firms</w:t>
+      </w:r>
+      <w:r>
+        <w:t>.</w:t>
+      </w:r>
+    </w:p>
     <w:sectPr>
       <w:pgSz w:w="12240" w:h="15840"/>
       <w:pgMar w:top="800" w:right="800" w:bottom="800" w:left="800" w:header="720" w:footer="720" w:gutter="0"/>

</xml_diff>